<commit_message>
Update prvotny zaznam, add tests and publish ARM64 RailInspect image
</commit_message>
<xml_diff>
--- a/backend/app/templates/prvotny_zaznam_z_template.docx
+++ b/backend/app/templates/prvotny_zaznam_z_template.docx
@@ -43,15 +43,13 @@
         <w:tblLook w:val="04A0" w:firstRow="1" w:lastRow="0" w:firstColumn="1" w:lastColumn="0" w:noHBand="0" w:noVBand="1"/>
       </w:tblPr>
       <w:tblGrid>
-        <w:gridCol w:w="2674"/>
-        <w:gridCol w:w="2675"/>
-        <w:gridCol w:w="2712"/>
-        <w:gridCol w:w="2713"/>
+        <w:gridCol w:w="5387"/>
+        <w:gridCol w:w="5387"/>
       </w:tblGrid>
       <w:tr ns2:paraId="6B8AA85C" ns2:textId="77777777">
         <w:tc>
           <w:tcPr>
-            <w:tcW w:w="5349" w:type="dxa"/>
+            <w:tcW w:w="10774" w:type="dxa"/>
             <w:gridSpan w:val="2"/>
             <w:tcBorders>
               <w:right w:val="thinThickThinSmallGap" w:sz="24" w:space="0" w:color="D9D9D9" w:themeColor="background1" w:themeShade="D9"/>
@@ -83,45 +81,11 @@
             </w:r>
           </w:p>
         </w:tc>
-        <w:tc>
-          <w:tcPr>
-            <w:tcW w:w="5425" w:type="dxa"/>
-            <w:gridSpan w:val="2"/>
-            <w:tcBorders>
-              <w:left w:val="thinThickThinSmallGap" w:sz="24" w:space="0" w:color="D9D9D9" w:themeColor="background1" w:themeShade="D9"/>
-            </w:tcBorders>
-          </w:tcPr>
-          <w:p>
-            <w:pPr>
-              <w:spacing w:before="0" w:after="0" w:line="220" w:lineRule="auto"/>
-            </w:pPr>
-            <w:r>
-              <w:rPr>
-                <w:sz w:val="18"/>
-                <w:szCs w:val="18"/>
-              </w:rPr>
-              <w:t>Označenie cisterny</w:t>
-              <w:br/>
-            </w:r>
-          </w:p>
-          <w:p>
-            <w:pPr>
-              <w:spacing w:before="0" w:after="0" w:line="220" w:lineRule="auto"/>
-            </w:pPr>
-            <w:r>
-              <w:rPr>
-                <w:sz w:val="18"/>
-                <w:szCs w:val="18"/>
-              </w:rPr>
-              <w:t>(č. vozňa): {{ tank_identification }}</w:t>
-            </w:r>
-          </w:p>
-        </w:tc>
       </w:tr>
       <w:tr ns2:paraId="17D87FA9" ns2:textId="77777777">
         <w:tc>
           <w:tcPr>
-            <w:tcW w:w="5349" w:type="dxa"/>
+            <w:tcW w:w="10774" w:type="dxa"/>
             <w:gridSpan w:val="2"/>
             <w:tcBorders>
               <w:right w:val="single" w:sz="12" w:space="0" w:color="D9D9D9" w:themeColor="background1" w:themeShade="D9"/>
@@ -134,646 +98,335 @@
             </w:pPr>
           </w:p>
         </w:tc>
-        <w:tc>
-          <w:tcPr>
-            <w:tcW w:w="5425" w:type="dxa"/>
-            <w:gridSpan w:val="2"/>
-            <w:tcBorders>
-              <w:left w:val="single" w:sz="12" w:space="0" w:color="D9D9D9" w:themeColor="background1" w:themeShade="D9"/>
+      </w:tr>
+      <w:tr ns2:paraId="2EFB444F" ns2:textId="77777777">
+        <w:tc>
+          <w:tcPr>
+            <w:tcW w:w="10774" w:type="dxa"/>
+            <w:gridSpan w:val="2"/>
+            <w:tcBorders>
+              <w:right w:val="thinThickThinSmallGap" w:sz="24" w:space="0" w:color="D9D9D9" w:themeColor="background1" w:themeShade="D9"/>
+            </w:tcBorders>
+          </w:tcPr>
+          <w:p>
+            <w:pPr>
+              <w:spacing w:before="0" w:after="0" w:line="220" w:lineRule="auto"/>
+            </w:pPr>
+            <w:r>
+              <w:rPr>
+                <w:sz w:val="18"/>
+                <w:szCs w:val="18"/>
+              </w:rPr>
+              <w:t>Miesto skúšky: {{ inspection_place }}    Dátum skúšky: {{ inspection_date }}</w:t>
+            </w:r>
+          </w:p>
+        </w:tc>
+      </w:tr>
+      <w:tr ns2:paraId="581F4B81" ns2:textId="77777777">
+        <w:tc>
+          <w:tcPr>
+            <w:tcW w:w="10774" w:type="dxa"/>
+            <w:gridSpan w:val="2"/>
+            <w:tcBorders>
+              <w:right w:val="thinThickThinSmallGap" w:sz="24" w:space="0" w:color="D9D9D9" w:themeColor="background1" w:themeShade="D9"/>
+            </w:tcBorders>
+          </w:tcPr>
+          <w:p>
+            <w:pPr>
+              <w:spacing w:before="0" w:after="0" w:line="220" w:lineRule="auto"/>
+            </w:pPr>
+            <w:r>
+              <w:rPr>
+                <w:sz w:val="18"/>
+                <w:szCs w:val="18"/>
+              </w:rPr>
+              <w:t>č. zákazky / č. objednávky: {{ order_number }}</w:t>
+            </w:r>
+          </w:p>
+        </w:tc>
+      </w:tr>
+      <w:tr ns2:paraId="147C128F" ns2:textId="77777777">
+        <w:tc>
+          <w:tcPr>
+            <w:tcW w:w="10774" w:type="dxa"/>
+            <w:gridSpan w:val="2"/>
+            <w:tcBorders>
+              <w:right w:val="thinThickThinSmallGap" w:sz="24" w:space="0" w:color="D9D9D9" w:themeColor="background1" w:themeShade="D9"/>
+            </w:tcBorders>
+          </w:tcPr>
+          <w:p>
+            <w:pPr>
+              <w:spacing w:before="0" w:after="0" w:line="220" w:lineRule="auto"/>
+            </w:pPr>
+            <w:r>
+              <w:rPr>
+                <w:sz w:val="18"/>
+                <w:szCs w:val="18"/>
+              </w:rPr>
+              <w:t>Poradové číslo / číslo certifikátu: {{ certificate_number }}</w:t>
+            </w:r>
+          </w:p>
+        </w:tc>
+      </w:tr>
+      <w:tr ns2:paraId="77EEAC7D" ns2:textId="77777777">
+        <w:tc>
+          <w:tcPr>
+            <w:tcW w:w="10774" w:type="dxa"/>
+            <w:gridSpan w:val="2"/>
+            <w:tcBorders>
+              <w:right w:val="single" w:sz="12" w:space="0" w:color="D9D9D9" w:themeColor="background1" w:themeShade="D9"/>
             </w:tcBorders>
             <w:shd w:val="clear" w:color="auto" w:fill="D9D9D9" w:themeFill="background1" w:themeFillShade="D9"/>
           </w:tcPr>
-          <w:p ns2:paraId="139A0C59" ns2:textId="77777777">
+          <w:p ns2:paraId="76E0C2CD" ns2:textId="77777777">
             <w:pPr>
               <w:spacing w:line="120" w:lineRule="auto"/>
             </w:pPr>
           </w:p>
         </w:tc>
       </w:tr>
-      <w:tr ns2:paraId="2EFB444F" ns2:textId="77777777">
-        <w:tc>
-          <w:tcPr>
-            <w:tcW w:w="5349" w:type="dxa"/>
-            <w:gridSpan w:val="2"/>
-            <w:tcBorders>
-              <w:right w:val="thinThickThinSmallGap" w:sz="24" w:space="0" w:color="D9D9D9" w:themeColor="background1" w:themeShade="D9"/>
-            </w:tcBorders>
-          </w:tcPr>
-          <w:p>
-            <w:pPr>
-              <w:spacing w:before="0" w:after="0" w:line="220" w:lineRule="auto"/>
-            </w:pPr>
-            <w:r>
-              <w:rPr>
-                <w:sz w:val="18"/>
-                <w:szCs w:val="18"/>
-              </w:rPr>
-              <w:t>Miesto skúšky: {{ inspection_place }}    Dátum skúšky: {{ inspection_date }}</w:t>
-            </w:r>
-          </w:p>
-        </w:tc>
-        <w:tc>
-          <w:tcPr>
-            <w:tcW w:w="5425" w:type="dxa"/>
-            <w:gridSpan w:val="2"/>
-            <w:tcBorders>
-              <w:left w:val="thinThickThinSmallGap" w:sz="24" w:space="0" w:color="D9D9D9" w:themeColor="background1" w:themeShade="D9"/>
-            </w:tcBorders>
-          </w:tcPr>
-          <w:p>
-            <w:pPr>
-              <w:spacing w:before="0" w:after="0" w:line="220" w:lineRule="auto"/>
-            </w:pPr>
-            <w:r>
-              <w:rPr>
-                <w:sz w:val="18"/>
-                <w:szCs w:val="18"/>
-              </w:rPr>
-              <w:t>Miesto skúšky: {{ inspection_place }}    Dátum skúšky: {{ inspection_date }}</w:t>
-            </w:r>
-          </w:p>
-        </w:tc>
-      </w:tr>
-      <w:tr ns2:paraId="581F4B81" ns2:textId="77777777">
-        <w:tc>
-          <w:tcPr>
-            <w:tcW w:w="5349" w:type="dxa"/>
-            <w:gridSpan w:val="2"/>
-            <w:tcBorders>
-              <w:right w:val="thinThickThinSmallGap" w:sz="24" w:space="0" w:color="D9D9D9" w:themeColor="background1" w:themeShade="D9"/>
-            </w:tcBorders>
-          </w:tcPr>
-          <w:p>
-            <w:pPr>
-              <w:spacing w:before="0" w:after="0" w:line="220" w:lineRule="auto"/>
-            </w:pPr>
-            <w:r>
-              <w:rPr>
-                <w:sz w:val="18"/>
-                <w:szCs w:val="18"/>
-              </w:rPr>
-              <w:t>č. zákazky / č. objednávky: {{ order_number }}</w:t>
-            </w:r>
-          </w:p>
-        </w:tc>
-        <w:tc>
-          <w:tcPr>
-            <w:tcW w:w="5425" w:type="dxa"/>
-            <w:gridSpan w:val="2"/>
-            <w:tcBorders>
-              <w:left w:val="thinThickThinSmallGap" w:sz="24" w:space="0" w:color="D9D9D9" w:themeColor="background1" w:themeShade="D9"/>
-            </w:tcBorders>
-          </w:tcPr>
-          <w:p>
-            <w:pPr>
-              <w:spacing w:before="0" w:after="0" w:line="220" w:lineRule="auto"/>
-            </w:pPr>
-            <w:r>
-              <w:rPr>
-                <w:sz w:val="18"/>
-                <w:szCs w:val="18"/>
-              </w:rPr>
-              <w:t>č. zákazky / č. objednávky: {{ order_number }}</w:t>
-            </w:r>
-          </w:p>
-        </w:tc>
-      </w:tr>
-      <w:tr ns2:paraId="147C128F" ns2:textId="77777777">
-        <w:tc>
-          <w:tcPr>
-            <w:tcW w:w="5349" w:type="dxa"/>
-            <w:gridSpan w:val="2"/>
-            <w:tcBorders>
-              <w:right w:val="thinThickThinSmallGap" w:sz="24" w:space="0" w:color="D9D9D9" w:themeColor="background1" w:themeShade="D9"/>
-            </w:tcBorders>
-          </w:tcPr>
-          <w:p>
-            <w:pPr>
-              <w:spacing w:before="0" w:after="0" w:line="220" w:lineRule="auto"/>
-            </w:pPr>
-            <w:r>
-              <w:rPr>
-                <w:sz w:val="18"/>
-                <w:szCs w:val="18"/>
-              </w:rPr>
-              <w:t>Poradové číslo / číslo certifikátu: {{ certificate_number }}</w:t>
-            </w:r>
-          </w:p>
-        </w:tc>
-        <w:tc>
-          <w:tcPr>
-            <w:tcW w:w="5425" w:type="dxa"/>
-            <w:gridSpan w:val="2"/>
-            <w:tcBorders>
-              <w:left w:val="thinThickThinSmallGap" w:sz="24" w:space="0" w:color="D9D9D9" w:themeColor="background1" w:themeShade="D9"/>
-            </w:tcBorders>
-          </w:tcPr>
-          <w:p>
-            <w:pPr>
-              <w:spacing w:before="0" w:after="0" w:line="220" w:lineRule="auto"/>
-            </w:pPr>
-            <w:r>
-              <w:rPr>
-                <w:sz w:val="18"/>
-                <w:szCs w:val="18"/>
-              </w:rPr>
-              <w:t>Poradové číslo / číslo certifikátu: {{ certificate_number }}</w:t>
-            </w:r>
-          </w:p>
-        </w:tc>
-      </w:tr>
-      <w:tr ns2:paraId="77EEAC7D" ns2:textId="77777777">
-        <w:tc>
-          <w:tcPr>
-            <w:tcW w:w="5349" w:type="dxa"/>
+      <w:tr ns2:paraId="5D949FDF" ns2:textId="77777777">
+        <w:tc>
+          <w:tcPr>
+            <w:tcW w:w="10774" w:type="dxa"/>
+            <w:gridSpan w:val="2"/>
+            <w:tcBorders>
+              <w:right w:val="thinThickThinSmallGap" w:sz="24" w:space="0" w:color="D9D9D9" w:themeColor="background1" w:themeShade="D9"/>
+            </w:tcBorders>
+          </w:tcPr>
+          <w:p>
+            <w:pPr>
+              <w:spacing w:before="0" w:after="0" w:line="220" w:lineRule="auto"/>
+            </w:pPr>
+            <w:r>
+              <w:rPr>
+                <w:sz w:val="18"/>
+                <w:szCs w:val="18"/>
+              </w:rPr>
+              <w:t>Číslo kotla: {{ tank_serial_number }}    Rok výroby: {{ year_of_manufacture }}</w:t>
+            </w:r>
+          </w:p>
+        </w:tc>
+      </w:tr>
+      <w:tr ns2:paraId="4282CBF2" ns2:textId="77777777">
+        <w:tc>
+          <w:tcPr>
+            <w:tcW w:w="10774" w:type="dxa"/>
+            <w:gridSpan w:val="2"/>
+            <w:tcBorders>
+              <w:right w:val="thinThickThinSmallGap" w:sz="24" w:space="0" w:color="D9D9D9" w:themeColor="background1" w:themeShade="D9"/>
+            </w:tcBorders>
+          </w:tcPr>
+          <w:p>
+            <w:pPr>
+              <w:spacing w:before="0" w:after="0" w:line="220" w:lineRule="auto"/>
+            </w:pPr>
+            <w:r>
+              <w:rPr>
+                <w:sz w:val="18"/>
+                <w:szCs w:val="18"/>
+              </w:rPr>
+              <w:t>Číslo schválenia typu: {{ type_approval_number }}</w:t>
+            </w:r>
+          </w:p>
+        </w:tc>
+      </w:tr>
+      <w:tr ns2:paraId="2937F086" ns2:textId="77777777">
+        <w:tc>
+          <w:tcPr>
+            <w:tcW w:w="10774" w:type="dxa"/>
+            <w:gridSpan w:val="2"/>
+            <w:tcBorders>
+              <w:right w:val="thinThickThinSmallGap" w:sz="24" w:space="0" w:color="D9D9D9" w:themeColor="background1" w:themeShade="D9"/>
+            </w:tcBorders>
+          </w:tcPr>
+          <w:p>
+            <w:pPr>
+              <w:spacing w:before="0" w:after="0" w:line="220" w:lineRule="auto"/>
+            </w:pPr>
+            <w:r>
+              <w:rPr>
+                <w:sz w:val="18"/>
+                <w:szCs w:val="18"/>
+              </w:rPr>
+              <w:t>Názov výrobcu kotla: {{ tank_manufacturer_name }}</w:t>
+            </w:r>
+          </w:p>
+        </w:tc>
+      </w:tr>
+      <w:tr ns2:paraId="7446198F" ns2:textId="77777777">
+        <w:tc>
+          <w:tcPr>
+            <w:tcW w:w="10774" w:type="dxa"/>
+            <w:gridSpan w:val="2"/>
+            <w:tcBorders>
+              <w:right w:val="thinThickThinSmallGap" w:sz="24" w:space="0" w:color="D9D9D9" w:themeColor="background1" w:themeShade="D9"/>
+            </w:tcBorders>
+          </w:tcPr>
+          <w:p>
+            <w:pPr>
+              <w:spacing w:before="0" w:after="0" w:line="220" w:lineRule="auto"/>
+            </w:pPr>
+            <w:r>
+              <w:rPr>
+                <w:sz w:val="18"/>
+                <w:szCs w:val="18"/>
+              </w:rPr>
+              <w:t>Objem v litroch: {{ capacity_liters }}    Držiteľ: {{ holder_name }}</w:t>
+            </w:r>
+          </w:p>
+        </w:tc>
+      </w:tr>
+      <w:tr ns2:paraId="15BCD6A5" ns2:textId="77777777">
+        <w:tc>
+          <w:tcPr>
+            <w:tcW w:w="10774" w:type="dxa"/>
+            <w:gridSpan w:val="2"/>
+            <w:tcBorders>
+              <w:right w:val="thinThickThinSmallGap" w:sz="24" w:space="0" w:color="D9D9D9" w:themeColor="background1" w:themeShade="D9"/>
+            </w:tcBorders>
+          </w:tcPr>
+          <w:p>
+            <w:pPr>
+              <w:spacing w:before="0" w:after="0" w:line="220" w:lineRule="auto"/>
+            </w:pPr>
+            <w:r>
+              <w:rPr>
+                <w:sz w:val="18"/>
+                <w:szCs w:val="18"/>
+              </w:rPr>
+              <w:t>Dátum a druh poslednej skúšky: {{ last_inspection_date_type }}</w:t>
+            </w:r>
+          </w:p>
+        </w:tc>
+      </w:tr>
+      <w:tr ns2:paraId="2E4E9043" ns2:textId="77777777">
+        <w:tc>
+          <w:tcPr>
+            <w:tcW w:w="5387" w:type="dxa"/>
+            <w:tcBorders>
+              <w:right w:val="single" w:sz="4" w:space="0" w:color="auto"/>
+            </w:tcBorders>
+          </w:tcPr>
+          <w:p>
+            <w:pPr>
+              <w:spacing w:before="0" w:after="0" w:line="220" w:lineRule="auto"/>
+            </w:pPr>
+            <w:r>
+              <w:rPr>
+                <w:sz w:val="18"/>
+                <w:szCs w:val="18"/>
+              </w:rPr>
+              <w:t>P: {{ periodic_inspection_date }}</w:t>
+            </w:r>
+          </w:p>
+        </w:tc>
+        <w:tc>
+          <w:tcPr>
+            <w:tcW w:w="5387" w:type="dxa"/>
+            <w:tcBorders>
+              <w:left w:val="single" w:sz="4" w:space="0" w:color="auto"/>
+              <w:right w:val="thinThickThinSmallGap" w:sz="24" w:space="0" w:color="D9D9D9" w:themeColor="background1" w:themeShade="D9"/>
+            </w:tcBorders>
+          </w:tcPr>
+          <w:p>
+            <w:pPr>
+              <w:spacing w:before="0" w:after="0" w:line="220" w:lineRule="auto"/>
+            </w:pPr>
+            <w:r>
+              <w:rPr>
+                <w:sz w:val="18"/>
+                <w:szCs w:val="18"/>
+              </w:rPr>
+              <w:t>L: {{ intermediate_inspection_date }}</w:t>
+            </w:r>
+          </w:p>
+        </w:tc>
+      </w:tr>
+      <w:tr ns2:paraId="09FE00D2" ns2:textId="77777777">
+        <w:tc>
+          <w:tcPr>
+            <w:tcW w:w="10774" w:type="dxa"/>
             <w:gridSpan w:val="2"/>
             <w:tcBorders>
               <w:right w:val="single" w:sz="12" w:space="0" w:color="D9D9D9" w:themeColor="background1" w:themeShade="D9"/>
             </w:tcBorders>
             <w:shd w:val="clear" w:color="auto" w:fill="D9D9D9" w:themeFill="background1" w:themeFillShade="D9"/>
           </w:tcPr>
-          <w:p ns2:paraId="76E0C2CD" ns2:textId="77777777">
+          <w:p ns2:paraId="1701318F" ns2:textId="77777777">
             <w:pPr>
               <w:spacing w:line="120" w:lineRule="auto"/>
             </w:pPr>
           </w:p>
         </w:tc>
-        <w:tc>
-          <w:tcPr>
-            <w:tcW w:w="5425" w:type="dxa"/>
-            <w:gridSpan w:val="2"/>
-            <w:tcBorders>
-              <w:left w:val="single" w:sz="12" w:space="0" w:color="D9D9D9" w:themeColor="background1" w:themeShade="D9"/>
+      </w:tr>
+      <w:tr ns2:paraId="4B13E5DD" ns2:textId="77777777">
+        <w:tc>
+          <w:tcPr>
+            <w:tcW w:w="10774" w:type="dxa"/>
+            <w:gridSpan w:val="2"/>
+            <w:tcBorders>
+              <w:right w:val="thinThickThinSmallGap" w:sz="24" w:space="0" w:color="D9D9D9" w:themeColor="background1" w:themeShade="D9"/>
+            </w:tcBorders>
+          </w:tcPr>
+          <w:p>
+            <w:pPr>
+              <w:spacing w:before="0" w:after="0" w:line="220" w:lineRule="auto"/>
+            </w:pPr>
+            <w:r>
+              <w:rPr>
+                <w:sz w:val="18"/>
+                <w:szCs w:val="18"/>
+              </w:rPr>
+              <w:t>Tankcode: {{ tank_code }}    Aktuálna skúška: {{ current_inspection_type_label }}</w:t>
+            </w:r>
+          </w:p>
+        </w:tc>
+      </w:tr>
+      <w:tr ns2:paraId="4B1DFA6E" ns2:textId="77777777">
+        <w:tc>
+          <w:tcPr>
+            <w:tcW w:w="10774" w:type="dxa"/>
+            <w:gridSpan w:val="2"/>
+            <w:tcBorders>
+              <w:right w:val="thinThickThinSmallGap" w:sz="24" w:space="0" w:color="D9D9D9" w:themeColor="background1" w:themeShade="D9"/>
+            </w:tcBorders>
+          </w:tcPr>
+          <w:p>
+            <w:pPr>
+              <w:spacing w:before="0" w:after="0" w:line="220" w:lineRule="auto"/>
+            </w:pPr>
+            <w:r>
+              <w:rPr>
+                <w:sz w:val="18"/>
+                <w:szCs w:val="18"/>
+              </w:rPr>
+              <w:t>Ložný tovar: {{ cargo_substances }}</w:t>
+            </w:r>
+          </w:p>
+        </w:tc>
+      </w:tr>
+      <w:tr ns2:paraId="3FF509E5" ns2:textId="77777777">
+        <w:tc>
+          <w:tcPr>
+            <w:tcW w:w="10774" w:type="dxa"/>
+            <w:gridSpan w:val="2"/>
+            <w:tcBorders>
+              <w:right w:val="single" w:sz="12" w:space="0" w:color="D9D9D9" w:themeColor="background1" w:themeShade="D9"/>
             </w:tcBorders>
             <w:shd w:val="clear" w:color="auto" w:fill="D9D9D9" w:themeFill="background1" w:themeFillShade="D9"/>
           </w:tcPr>
-          <w:p ns2:paraId="279E1DEC" ns2:textId="77777777">
+          <w:p ns2:paraId="581D2A7F" ns2:textId="77777777">
             <w:pPr>
               <w:spacing w:line="120" w:lineRule="auto"/>
             </w:pPr>
           </w:p>
         </w:tc>
       </w:tr>
-      <w:tr ns2:paraId="5D949FDF" ns2:textId="77777777">
-        <w:tc>
-          <w:tcPr>
-            <w:tcW w:w="5349" w:type="dxa"/>
-            <w:gridSpan w:val="2"/>
-            <w:tcBorders>
-              <w:right w:val="thinThickThinSmallGap" w:sz="24" w:space="0" w:color="D9D9D9" w:themeColor="background1" w:themeShade="D9"/>
-            </w:tcBorders>
-          </w:tcPr>
-          <w:p>
-            <w:pPr>
-              <w:spacing w:before="0" w:after="0" w:line="220" w:lineRule="auto"/>
-            </w:pPr>
-            <w:r>
-              <w:rPr>
-                <w:sz w:val="18"/>
-                <w:szCs w:val="18"/>
-              </w:rPr>
-              <w:t>Číslo kotla: {{ tank_serial_number }}    Rok výroby: {{ year_of_manufacture }}</w:t>
-            </w:r>
-          </w:p>
-        </w:tc>
-        <w:tc>
-          <w:tcPr>
-            <w:tcW w:w="5425" w:type="dxa"/>
-            <w:gridSpan w:val="2"/>
-            <w:tcBorders>
-              <w:left w:val="thinThickThinSmallGap" w:sz="24" w:space="0" w:color="D9D9D9" w:themeColor="background1" w:themeShade="D9"/>
-            </w:tcBorders>
-          </w:tcPr>
-          <w:p>
-            <w:pPr>
-              <w:spacing w:before="0" w:after="0" w:line="220" w:lineRule="auto"/>
-            </w:pPr>
-            <w:r>
-              <w:rPr>
-                <w:sz w:val="18"/>
-                <w:szCs w:val="18"/>
-              </w:rPr>
-              <w:t>Číslo kotla: {{ tank_serial_number }}    Rok výroby: {{ year_of_manufacture }}</w:t>
-            </w:r>
-          </w:p>
-        </w:tc>
-      </w:tr>
-      <w:tr ns2:paraId="4282CBF2" ns2:textId="77777777">
-        <w:tc>
-          <w:tcPr>
-            <w:tcW w:w="5349" w:type="dxa"/>
-            <w:gridSpan w:val="2"/>
-            <w:tcBorders>
-              <w:right w:val="thinThickThinSmallGap" w:sz="24" w:space="0" w:color="D9D9D9" w:themeColor="background1" w:themeShade="D9"/>
-            </w:tcBorders>
-          </w:tcPr>
-          <w:p>
-            <w:pPr>
-              <w:spacing w:before="0" w:after="0" w:line="220" w:lineRule="auto"/>
-            </w:pPr>
-            <w:r>
-              <w:rPr>
-                <w:sz w:val="18"/>
-                <w:szCs w:val="18"/>
-              </w:rPr>
-              <w:t>Číslo schválenia typu: {{ type_approval_number }}</w:t>
-            </w:r>
-          </w:p>
-        </w:tc>
-        <w:tc>
-          <w:tcPr>
-            <w:tcW w:w="5425" w:type="dxa"/>
-            <w:gridSpan w:val="2"/>
-            <w:tcBorders>
-              <w:left w:val="thinThickThinSmallGap" w:sz="24" w:space="0" w:color="D9D9D9" w:themeColor="background1" w:themeShade="D9"/>
-            </w:tcBorders>
-          </w:tcPr>
-          <w:p>
-            <w:pPr>
-              <w:spacing w:before="0" w:after="0" w:line="220" w:lineRule="auto"/>
-            </w:pPr>
-            <w:r>
-              <w:rPr>
-                <w:sz w:val="18"/>
-                <w:szCs w:val="18"/>
-              </w:rPr>
-              <w:t>Číslo schválenia typu: {{ type_approval_number }}</w:t>
-            </w:r>
-          </w:p>
-        </w:tc>
-      </w:tr>
-      <w:tr ns2:paraId="2937F086" ns2:textId="77777777">
-        <w:tc>
-          <w:tcPr>
-            <w:tcW w:w="5349" w:type="dxa"/>
-            <w:gridSpan w:val="2"/>
-            <w:tcBorders>
-              <w:right w:val="thinThickThinSmallGap" w:sz="24" w:space="0" w:color="D9D9D9" w:themeColor="background1" w:themeShade="D9"/>
-            </w:tcBorders>
-          </w:tcPr>
-          <w:p>
-            <w:pPr>
-              <w:spacing w:before="0" w:after="0" w:line="220" w:lineRule="auto"/>
-            </w:pPr>
-            <w:r>
-              <w:rPr>
-                <w:sz w:val="18"/>
-                <w:szCs w:val="18"/>
-              </w:rPr>
-              <w:t>Názov výrobcu kotla: {{ tank_manufacturer_name }}</w:t>
-            </w:r>
-          </w:p>
-        </w:tc>
-        <w:tc>
-          <w:tcPr>
-            <w:tcW w:w="5425" w:type="dxa"/>
-            <w:gridSpan w:val="2"/>
-            <w:tcBorders>
-              <w:left w:val="thinThickThinSmallGap" w:sz="24" w:space="0" w:color="D9D9D9" w:themeColor="background1" w:themeShade="D9"/>
-            </w:tcBorders>
-          </w:tcPr>
-          <w:p>
-            <w:pPr>
-              <w:spacing w:before="0" w:after="0" w:line="220" w:lineRule="auto"/>
-            </w:pPr>
-            <w:r>
-              <w:rPr>
-                <w:sz w:val="18"/>
-                <w:szCs w:val="18"/>
-              </w:rPr>
-              <w:t>Názov výrobcu kotla: {{ tank_manufacturer_name }}</w:t>
-            </w:r>
-          </w:p>
-        </w:tc>
-      </w:tr>
-      <w:tr ns2:paraId="7446198F" ns2:textId="77777777">
-        <w:tc>
-          <w:tcPr>
-            <w:tcW w:w="5349" w:type="dxa"/>
-            <w:gridSpan w:val="2"/>
-            <w:tcBorders>
-              <w:right w:val="thinThickThinSmallGap" w:sz="24" w:space="0" w:color="D9D9D9" w:themeColor="background1" w:themeShade="D9"/>
-            </w:tcBorders>
-          </w:tcPr>
-          <w:p>
-            <w:pPr>
-              <w:spacing w:before="0" w:after="0" w:line="220" w:lineRule="auto"/>
-            </w:pPr>
-            <w:r>
-              <w:rPr>
-                <w:sz w:val="18"/>
-                <w:szCs w:val="18"/>
-              </w:rPr>
-              <w:t>Objem v litroch: {{ capacity_liters }}    Držiteľ: {{ holder_name }}</w:t>
-            </w:r>
-          </w:p>
-        </w:tc>
-        <w:tc>
-          <w:tcPr>
-            <w:tcW w:w="5425" w:type="dxa"/>
-            <w:gridSpan w:val="2"/>
-            <w:tcBorders>
-              <w:left w:val="thinThickThinSmallGap" w:sz="24" w:space="0" w:color="D9D9D9" w:themeColor="background1" w:themeShade="D9"/>
-            </w:tcBorders>
-          </w:tcPr>
-          <w:p>
-            <w:pPr>
-              <w:spacing w:before="0" w:after="0" w:line="220" w:lineRule="auto"/>
-            </w:pPr>
-            <w:r>
-              <w:rPr>
-                <w:sz w:val="18"/>
-                <w:szCs w:val="18"/>
-              </w:rPr>
-              <w:t>Objem v litroch: {{ capacity_liters }}    Držiteľ: {{ holder_name }}</w:t>
-            </w:r>
-          </w:p>
-        </w:tc>
-      </w:tr>
-      <w:tr ns2:paraId="15BCD6A5" ns2:textId="77777777">
-        <w:tc>
-          <w:tcPr>
-            <w:tcW w:w="5349" w:type="dxa"/>
-            <w:gridSpan w:val="2"/>
-            <w:tcBorders>
-              <w:right w:val="thinThickThinSmallGap" w:sz="24" w:space="0" w:color="D9D9D9" w:themeColor="background1" w:themeShade="D9"/>
-            </w:tcBorders>
-          </w:tcPr>
-          <w:p>
-            <w:pPr>
-              <w:spacing w:before="0" w:after="0" w:line="220" w:lineRule="auto"/>
-            </w:pPr>
-            <w:r>
-              <w:rPr>
-                <w:sz w:val="18"/>
-                <w:szCs w:val="18"/>
-              </w:rPr>
-              <w:t>Dátum a druh poslednej skúšky: {{ last_inspection_date_type }}</w:t>
-            </w:r>
-          </w:p>
-        </w:tc>
-        <w:tc>
-          <w:tcPr>
-            <w:tcW w:w="5425" w:type="dxa"/>
-            <w:gridSpan w:val="2"/>
-            <w:tcBorders>
-              <w:left w:val="thinThickThinSmallGap" w:sz="24" w:space="0" w:color="D9D9D9" w:themeColor="background1" w:themeShade="D9"/>
-            </w:tcBorders>
-          </w:tcPr>
-          <w:p>
-            <w:pPr>
-              <w:spacing w:before="0" w:after="0" w:line="220" w:lineRule="auto"/>
-            </w:pPr>
-            <w:r>
-              <w:rPr>
-                <w:sz w:val="18"/>
-                <w:szCs w:val="18"/>
-              </w:rPr>
-              <w:t>Dátum a druh poslednej skúšky: {{ last_inspection_date_type }}</w:t>
-            </w:r>
-          </w:p>
-        </w:tc>
-      </w:tr>
-      <w:tr ns2:paraId="2E4E9043" ns2:textId="77777777">
-        <w:tc>
-          <w:tcPr>
-            <w:tcW w:w="2674" w:type="dxa"/>
-            <w:tcBorders>
-              <w:right w:val="single" w:sz="4" w:space="0" w:color="auto"/>
-            </w:tcBorders>
-          </w:tcPr>
-          <w:p>
-            <w:pPr>
-              <w:spacing w:before="0" w:after="0" w:line="220" w:lineRule="auto"/>
-            </w:pPr>
-            <w:r>
-              <w:rPr>
-                <w:sz w:val="18"/>
-                <w:szCs w:val="18"/>
-              </w:rPr>
-              <w:t>P: {{ periodic_inspection_date }}</w:t>
-            </w:r>
-          </w:p>
-        </w:tc>
-        <w:tc>
-          <w:tcPr>
-            <w:tcW w:w="2675" w:type="dxa"/>
-            <w:tcBorders>
-              <w:left w:val="single" w:sz="4" w:space="0" w:color="auto"/>
-              <w:right w:val="thinThickThinSmallGap" w:sz="24" w:space="0" w:color="D9D9D9" w:themeColor="background1" w:themeShade="D9"/>
-            </w:tcBorders>
-          </w:tcPr>
-          <w:p>
-            <w:pPr>
-              <w:spacing w:before="0" w:after="0" w:line="220" w:lineRule="auto"/>
-            </w:pPr>
-            <w:r>
-              <w:rPr>
-                <w:sz w:val="18"/>
-                <w:szCs w:val="18"/>
-              </w:rPr>
-              <w:t>L: {{ intermediate_inspection_date }}</w:t>
-            </w:r>
-          </w:p>
-        </w:tc>
-        <w:tc>
-          <w:tcPr>
-            <w:tcW w:w="2712" w:type="dxa"/>
-            <w:tcBorders>
-              <w:left w:val="thinThickThinSmallGap" w:sz="24" w:space="0" w:color="D9D9D9" w:themeColor="background1" w:themeShade="D9"/>
-              <w:right w:val="single" w:sz="4" w:space="0" w:color="auto"/>
-            </w:tcBorders>
-          </w:tcPr>
-          <w:p>
-            <w:pPr>
-              <w:spacing w:before="0" w:after="0" w:line="220" w:lineRule="auto"/>
-            </w:pPr>
-            <w:r>
-              <w:rPr>
-                <w:sz w:val="18"/>
-                <w:szCs w:val="18"/>
-              </w:rPr>
-              <w:t>P: {{ periodic_inspection_date }}</w:t>
-            </w:r>
-          </w:p>
-        </w:tc>
-        <w:tc>
-          <w:tcPr>
-            <w:tcW w:w="2713" w:type="dxa"/>
-            <w:tcBorders>
-              <w:left w:val="single" w:sz="4" w:space="0" w:color="auto"/>
-            </w:tcBorders>
-          </w:tcPr>
-          <w:p>
-            <w:pPr>
-              <w:spacing w:before="0" w:after="0" w:line="220" w:lineRule="auto"/>
-            </w:pPr>
-            <w:r>
-              <w:rPr>
-                <w:sz w:val="18"/>
-                <w:szCs w:val="18"/>
-              </w:rPr>
-              <w:t>L: {{ intermediate_inspection_date }}</w:t>
-            </w:r>
-          </w:p>
-        </w:tc>
-      </w:tr>
-      <w:tr ns2:paraId="09FE00D2" ns2:textId="77777777">
-        <w:tc>
-          <w:tcPr>
-            <w:tcW w:w="5349" w:type="dxa"/>
-            <w:gridSpan w:val="2"/>
-            <w:tcBorders>
-              <w:right w:val="single" w:sz="12" w:space="0" w:color="D9D9D9" w:themeColor="background1" w:themeShade="D9"/>
-            </w:tcBorders>
-            <w:shd w:val="clear" w:color="auto" w:fill="D9D9D9" w:themeFill="background1" w:themeFillShade="D9"/>
-          </w:tcPr>
-          <w:p ns2:paraId="1701318F" ns2:textId="77777777">
-            <w:pPr>
-              <w:spacing w:line="120" w:lineRule="auto"/>
-            </w:pPr>
-          </w:p>
-        </w:tc>
-        <w:tc>
-          <w:tcPr>
-            <w:tcW w:w="5425" w:type="dxa"/>
-            <w:gridSpan w:val="2"/>
-            <w:tcBorders>
-              <w:left w:val="single" w:sz="12" w:space="0" w:color="D9D9D9" w:themeColor="background1" w:themeShade="D9"/>
-            </w:tcBorders>
-            <w:shd w:val="clear" w:color="auto" w:fill="D9D9D9" w:themeFill="background1" w:themeFillShade="D9"/>
-          </w:tcPr>
-          <w:p ns2:paraId="23D6FEE9" ns2:textId="77777777">
-            <w:pPr>
-              <w:spacing w:line="120" w:lineRule="auto"/>
-            </w:pPr>
-          </w:p>
-        </w:tc>
-      </w:tr>
-      <w:tr ns2:paraId="4B13E5DD" ns2:textId="77777777">
-        <w:tc>
-          <w:tcPr>
-            <w:tcW w:w="5349" w:type="dxa"/>
-            <w:gridSpan w:val="2"/>
-            <w:tcBorders>
-              <w:right w:val="thinThickThinSmallGap" w:sz="24" w:space="0" w:color="D9D9D9" w:themeColor="background1" w:themeShade="D9"/>
-            </w:tcBorders>
-          </w:tcPr>
-          <w:p>
-            <w:pPr>
-              <w:spacing w:before="0" w:after="0" w:line="220" w:lineRule="auto"/>
-            </w:pPr>
-            <w:r>
-              <w:rPr>
-                <w:sz w:val="18"/>
-                <w:szCs w:val="18"/>
-              </w:rPr>
-              <w:t>Tankcode: {{ tank_code }}    Aktuálna skúška: {{ current_inspection_type_label }}</w:t>
-            </w:r>
-          </w:p>
-        </w:tc>
-        <w:tc>
-          <w:tcPr>
-            <w:tcW w:w="5425" w:type="dxa"/>
-            <w:gridSpan w:val="2"/>
-            <w:tcBorders>
-              <w:left w:val="thinThickThinSmallGap" w:sz="24" w:space="0" w:color="D9D9D9" w:themeColor="background1" w:themeShade="D9"/>
-            </w:tcBorders>
-          </w:tcPr>
-          <w:p>
-            <w:pPr>
-              <w:spacing w:before="0" w:after="0" w:line="220" w:lineRule="auto"/>
-            </w:pPr>
-            <w:r>
-              <w:rPr>
-                <w:sz w:val="18"/>
-                <w:szCs w:val="18"/>
-              </w:rPr>
-              <w:t>Tankcode: {{ tank_code }}    Aktuálna skúška: {{ current_inspection_type_label }}</w:t>
-            </w:r>
-          </w:p>
-        </w:tc>
-      </w:tr>
-      <w:tr ns2:paraId="4B1DFA6E" ns2:textId="77777777">
-        <w:tc>
-          <w:tcPr>
-            <w:tcW w:w="5349" w:type="dxa"/>
-            <w:gridSpan w:val="2"/>
-            <w:tcBorders>
-              <w:right w:val="thinThickThinSmallGap" w:sz="24" w:space="0" w:color="D9D9D9" w:themeColor="background1" w:themeShade="D9"/>
-            </w:tcBorders>
-          </w:tcPr>
-          <w:p>
-            <w:pPr>
-              <w:spacing w:before="0" w:after="0" w:line="220" w:lineRule="auto"/>
-            </w:pPr>
-            <w:r>
-              <w:rPr>
-                <w:sz w:val="18"/>
-                <w:szCs w:val="18"/>
-              </w:rPr>
-              <w:t>Ložný tovar: {{ cargo_substances }}</w:t>
-            </w:r>
-          </w:p>
-        </w:tc>
-        <w:tc>
-          <w:tcPr>
-            <w:tcW w:w="5425" w:type="dxa"/>
-            <w:gridSpan w:val="2"/>
-            <w:tcBorders>
-              <w:left w:val="thinThickThinSmallGap" w:sz="24" w:space="0" w:color="D9D9D9" w:themeColor="background1" w:themeShade="D9"/>
-            </w:tcBorders>
-          </w:tcPr>
-          <w:p>
-            <w:pPr>
-              <w:spacing w:before="0" w:after="0" w:line="220" w:lineRule="auto"/>
-            </w:pPr>
-            <w:r>
-              <w:rPr>
-                <w:sz w:val="18"/>
-                <w:szCs w:val="18"/>
-              </w:rPr>
-              <w:t>Ložný tovar: {{ cargo_substances }}</w:t>
-            </w:r>
-          </w:p>
-        </w:tc>
-      </w:tr>
-      <w:tr ns2:paraId="3FF509E5" ns2:textId="77777777">
-        <w:tc>
-          <w:tcPr>
-            <w:tcW w:w="5349" w:type="dxa"/>
-            <w:gridSpan w:val="2"/>
-            <w:tcBorders>
-              <w:right w:val="single" w:sz="12" w:space="0" w:color="D9D9D9" w:themeColor="background1" w:themeShade="D9"/>
-            </w:tcBorders>
-            <w:shd w:val="clear" w:color="auto" w:fill="D9D9D9" w:themeFill="background1" w:themeFillShade="D9"/>
-          </w:tcPr>
-          <w:p ns2:paraId="581D2A7F" ns2:textId="77777777">
-            <w:pPr>
-              <w:spacing w:line="120" w:lineRule="auto"/>
-            </w:pPr>
-          </w:p>
-        </w:tc>
-        <w:tc>
-          <w:tcPr>
-            <w:tcW w:w="5425" w:type="dxa"/>
-            <w:gridSpan w:val="2"/>
-            <w:tcBorders>
-              <w:left w:val="single" w:sz="12" w:space="0" w:color="D9D9D9" w:themeColor="background1" w:themeShade="D9"/>
-            </w:tcBorders>
-            <w:shd w:val="clear" w:color="auto" w:fill="D9D9D9" w:themeFill="background1" w:themeFillShade="D9"/>
-          </w:tcPr>
-          <w:p ns2:paraId="71F4307C" ns2:textId="77777777">
-            <w:pPr>
-              <w:spacing w:line="120" w:lineRule="auto"/>
-            </w:pPr>
-          </w:p>
-        </w:tc>
-      </w:tr>
       <w:tr ns2:paraId="63F1DCD2" ns2:textId="77777777">
         <w:tc>
           <w:tcPr>
-            <w:tcW w:w="5349" w:type="dxa"/>
+            <w:tcW w:w="10774" w:type="dxa"/>
             <w:gridSpan w:val="2"/>
             <w:tcBorders>
               <w:right w:val="thinThickThinSmallGap" w:sz="24" w:space="0" w:color="D9D9D9" w:themeColor="background1" w:themeShade="D9"/>
@@ -792,32 +445,11 @@
             </w:r>
           </w:p>
         </w:tc>
-        <w:tc>
-          <w:tcPr>
-            <w:tcW w:w="5425" w:type="dxa"/>
-            <w:gridSpan w:val="2"/>
-            <w:tcBorders>
-              <w:left w:val="thinThickThinSmallGap" w:sz="24" w:space="0" w:color="D9D9D9" w:themeColor="background1" w:themeShade="D9"/>
-            </w:tcBorders>
-          </w:tcPr>
-          <w:p>
-            <w:pPr>
-              <w:spacing w:before="0" w:after="0" w:line="220" w:lineRule="auto"/>
-            </w:pPr>
-            <w:r>
-              <w:rPr>
-                <w:sz w:val="18"/>
-                <w:szCs w:val="18"/>
-              </w:rPr>
-              <w:t>Prac. tlak: {{ working_pressure }} bar</w:t>
-            </w:r>
-          </w:p>
-        </w:tc>
       </w:tr>
       <w:tr ns2:paraId="28606611" ns2:textId="77777777">
         <w:tc>
           <w:tcPr>
-            <w:tcW w:w="5349" w:type="dxa"/>
+            <w:tcW w:w="10774" w:type="dxa"/>
             <w:gridSpan w:val="2"/>
             <w:tcBorders>
               <w:right w:val="thinThickThinSmallGap" w:sz="24" w:space="0" w:color="D9D9D9" w:themeColor="background1" w:themeShade="D9"/>
@@ -836,32 +468,11 @@
             </w:r>
           </w:p>
         </w:tc>
-        <w:tc>
-          <w:tcPr>
-            <w:tcW w:w="5425" w:type="dxa"/>
-            <w:gridSpan w:val="2"/>
-            <w:tcBorders>
-              <w:left w:val="thinThickThinSmallGap" w:sz="24" w:space="0" w:color="D9D9D9" w:themeColor="background1" w:themeShade="D9"/>
-            </w:tcBorders>
-          </w:tcPr>
-          <w:p>
-            <w:pPr>
-              <w:spacing w:before="0" w:after="0" w:line="220" w:lineRule="auto"/>
-            </w:pPr>
-            <w:r>
-              <w:rPr>
-                <w:sz w:val="18"/>
-                <w:szCs w:val="18"/>
-              </w:rPr>
-              <w:t>Skúšobný tlak: {{ test_pressure }} bar</w:t>
-            </w:r>
-          </w:p>
-        </w:tc>
       </w:tr>
       <w:tr ns2:paraId="6850E046" ns2:textId="77777777">
         <w:tc>
           <w:tcPr>
-            <w:tcW w:w="5349" w:type="dxa"/>
+            <w:tcW w:w="10774" w:type="dxa"/>
             <w:gridSpan w:val="2"/>
             <w:tcBorders>
               <w:right w:val="thinThickThinSmallGap" w:sz="24" w:space="0" w:color="D9D9D9" w:themeColor="background1" w:themeShade="D9"/>
@@ -880,56 +491,14 @@
             </w:r>
           </w:p>
         </w:tc>
-        <w:tc>
-          <w:tcPr>
-            <w:tcW w:w="5425" w:type="dxa"/>
-            <w:gridSpan w:val="2"/>
-            <w:tcBorders>
-              <w:left w:val="thinThickThinSmallGap" w:sz="24" w:space="0" w:color="D9D9D9" w:themeColor="background1" w:themeShade="D9"/>
-            </w:tcBorders>
-          </w:tcPr>
-          <w:p>
-            <w:pPr>
-              <w:spacing w:before="0" w:after="0" w:line="220" w:lineRule="auto"/>
-            </w:pPr>
-            <w:r>
-              <w:rPr>
-                <w:sz w:val="18"/>
-                <w:szCs w:val="18"/>
-              </w:rPr>
-              <w:t>Výpočtový tlak: {{ calculation_pressure }} bar</w:t>
-            </w:r>
-          </w:p>
-        </w:tc>
       </w:tr>
       <w:tr ns2:paraId="27995F6F" ns2:textId="77777777">
         <w:tc>
           <w:tcPr>
-            <w:tcW w:w="5349" w:type="dxa"/>
-            <w:gridSpan w:val="2"/>
-            <w:tcBorders>
-              <w:right w:val="thinThickThinSmallGap" w:sz="24" w:space="0" w:color="D9D9D9" w:themeColor="background1" w:themeShade="D9"/>
-            </w:tcBorders>
-          </w:tcPr>
-          <w:p>
-            <w:pPr>
-              <w:spacing w:before="0" w:after="0" w:line="220" w:lineRule="auto"/>
-            </w:pPr>
-            <w:r>
-              <w:rPr>
-                <w:sz w:val="18"/>
-                <w:szCs w:val="18"/>
-              </w:rPr>
-              <w:t>Aktual. skúš. tlak: {{ current_test_pressure }} bar</w:t>
-            </w:r>
-          </w:p>
-        </w:tc>
-        <w:tc>
-          <w:tcPr>
-            <w:tcW w:w="5425" w:type="dxa"/>
-            <w:gridSpan w:val="2"/>
-            <w:tcBorders>
-              <w:left w:val="thinThickThinSmallGap" w:sz="24" w:space="0" w:color="D9D9D9" w:themeColor="background1" w:themeShade="D9"/>
+            <w:tcW w:w="10774" w:type="dxa"/>
+            <w:gridSpan w:val="2"/>
+            <w:tcBorders>
+              <w:right w:val="thinThickThinSmallGap" w:sz="24" w:space="0" w:color="D9D9D9" w:themeColor="background1" w:themeShade="D9"/>
             </w:tcBorders>
           </w:tcPr>
           <w:p>
@@ -950,7 +519,7 @@
       <w:tr ns2:paraId="7ACF0402" ns2:textId="77777777">
         <w:tc>
           <w:tcPr>
-            <w:tcW w:w="5349" w:type="dxa"/>
+            <w:tcW w:w="10774" w:type="dxa"/>
             <w:gridSpan w:val="2"/>
             <w:tcBorders>
               <w:right w:val="single" w:sz="12" w:space="0" w:color="D9D9D9" w:themeColor="background1" w:themeShade="D9"/>
@@ -963,653 +532,340 @@
             </w:pPr>
           </w:p>
         </w:tc>
-        <w:tc>
-          <w:tcPr>
-            <w:tcW w:w="5425" w:type="dxa"/>
-            <w:gridSpan w:val="2"/>
-            <w:tcBorders>
-              <w:left w:val="single" w:sz="12" w:space="0" w:color="D9D9D9" w:themeColor="background1" w:themeShade="D9"/>
+      </w:tr>
+      <w:tr ns2:paraId="69B76A7F" ns2:textId="77777777">
+        <w:tc>
+          <w:tcPr>
+            <w:tcW w:w="10774" w:type="dxa"/>
+            <w:gridSpan w:val="2"/>
+            <w:tcBorders>
+              <w:right w:val="thinThickThinSmallGap" w:sz="24" w:space="0" w:color="D9D9D9" w:themeColor="background1" w:themeShade="D9"/>
+            </w:tcBorders>
+          </w:tcPr>
+          <w:p>
+            <w:pPr>
+              <w:spacing w:before="0" w:after="0" w:line="220" w:lineRule="auto"/>
+            </w:pPr>
+            <w:r>
+              <w:rPr>
+                <w:sz w:val="18"/>
+                <w:szCs w:val="18"/>
+              </w:rPr>
+              <w:t>Vonk. prehliadka: {{ external_inspection_result_label }}    Vnút. prehliadka: {{ internal_inspection_result_label }}</w:t>
+            </w:r>
+          </w:p>
+        </w:tc>
+      </w:tr>
+      <w:tr ns2:paraId="42C00107" ns2:textId="77777777">
+        <w:tc>
+          <w:tcPr>
+            <w:tcW w:w="10774" w:type="dxa"/>
+            <w:gridSpan w:val="2"/>
+            <w:tcBorders>
+              <w:right w:val="thinThickThinSmallGap" w:sz="24" w:space="0" w:color="D9D9D9" w:themeColor="background1" w:themeShade="D9"/>
+            </w:tcBorders>
+          </w:tcPr>
+          <w:p>
+            <w:pPr>
+              <w:spacing w:before="0" w:after="0" w:line="220" w:lineRule="auto"/>
+            </w:pPr>
+            <w:r>
+              <w:rPr>
+                <w:sz w:val="18"/>
+                <w:szCs w:val="18"/>
+              </w:rPr>
+              <w:t>Kontr. zvarov: {{ weld_inspection_result_label }}    Kontr. štítkov: {{ plate_inspection_result_label }}</w:t>
+            </w:r>
+          </w:p>
+        </w:tc>
+      </w:tr>
+      <w:tr ns2:paraId="5EB0D813" ns2:textId="77777777">
+        <w:tc>
+          <w:tcPr>
+            <w:tcW w:w="10774" w:type="dxa"/>
+            <w:gridSpan w:val="2"/>
+            <w:tcBorders>
+              <w:right w:val="thinThickThinSmallGap" w:sz="24" w:space="0" w:color="D9D9D9" w:themeColor="background1" w:themeShade="D9"/>
+            </w:tcBorders>
+          </w:tcPr>
+          <w:p>
+            <w:pPr>
+              <w:spacing w:before="0" w:after="0" w:line="220" w:lineRule="auto"/>
+            </w:pPr>
+            <w:r>
+              <w:rPr>
+                <w:sz w:val="18"/>
+                <w:szCs w:val="18"/>
+              </w:rPr>
+              <w:t>Preh. vykur. hadov: vonk. {{ heating_coils_external_result_label }}    vnút. {{ heating_coils_internal_result_label }}</w:t>
+            </w:r>
+          </w:p>
+        </w:tc>
+      </w:tr>
+      <w:tr ns2:paraId="74ACAB45" ns2:textId="77777777">
+        <w:tc>
+          <w:tcPr>
+            <w:tcW w:w="10774" w:type="dxa"/>
+            <w:gridSpan w:val="2"/>
+            <w:tcBorders>
+              <w:right w:val="thinThickThinSmallGap" w:sz="24" w:space="0" w:color="D9D9D9" w:themeColor="background1" w:themeShade="D9"/>
+            </w:tcBorders>
+          </w:tcPr>
+          <w:p>
+            <w:pPr>
+              <w:spacing w:before="0" w:after="0" w:line="220" w:lineRule="auto"/>
+            </w:pPr>
+            <w:r>
+              <w:rPr>
+                <w:sz w:val="18"/>
+                <w:szCs w:val="18"/>
+              </w:rPr>
+              <w:t>Bočné (výpus.) ventily: I.str. {{ side_valves_side_1_result_label }}    II.str. {{ side_valves_side_2_result_label }}</w:t>
+            </w:r>
+          </w:p>
+        </w:tc>
+      </w:tr>
+      <w:tr ns2:paraId="51136AE0" ns2:textId="77777777">
+        <w:tc>
+          <w:tcPr>
+            <w:tcW w:w="10774" w:type="dxa"/>
+            <w:gridSpan w:val="2"/>
+            <w:tcBorders>
+              <w:right w:val="thinThickThinSmallGap" w:sz="24" w:space="0" w:color="D9D9D9" w:themeColor="background1" w:themeShade="D9"/>
+            </w:tcBorders>
+          </w:tcPr>
+          <w:p>
+            <w:pPr>
+              <w:spacing w:before="0" w:after="0" w:line="220" w:lineRule="auto"/>
+            </w:pPr>
+            <w:r>
+              <w:rPr>
+                <w:sz w:val="18"/>
+                <w:szCs w:val="18"/>
+              </w:rPr>
+              <w:t>Stredový ventil: {{ center_valve_result_label }}</w:t>
+            </w:r>
+          </w:p>
+        </w:tc>
+      </w:tr>
+      <w:tr ns2:paraId="625DA006" ns2:textId="77777777">
+        <w:tc>
+          <w:tcPr>
+            <w:tcW w:w="10774" w:type="dxa"/>
+            <w:gridSpan w:val="2"/>
+            <w:tcBorders>
+              <w:right w:val="thinThickThinSmallGap" w:sz="24" w:space="0" w:color="D9D9D9" w:themeColor="background1" w:themeShade="D9"/>
+            </w:tcBorders>
+          </w:tcPr>
+          <w:p>
+            <w:pPr>
+              <w:spacing w:before="0" w:after="0" w:line="220" w:lineRule="auto"/>
+            </w:pPr>
+            <w:r>
+              <w:rPr>
+                <w:sz w:val="18"/>
+                <w:szCs w:val="18"/>
+              </w:rPr>
+              <w:t>veko + tesnenie: {{ lid_gasket_result_label }}</w:t>
+            </w:r>
+          </w:p>
+        </w:tc>
+      </w:tr>
+      <w:tr ns2:paraId="0776AD60" ns2:textId="77777777">
+        <w:tc>
+          <w:tcPr>
+            <w:tcW w:w="10774" w:type="dxa"/>
+            <w:gridSpan w:val="2"/>
+            <w:tcBorders>
+              <w:right w:val="thinThickThinSmallGap" w:sz="24" w:space="0" w:color="D9D9D9" w:themeColor="background1" w:themeShade="D9"/>
+            </w:tcBorders>
+          </w:tcPr>
+          <w:p>
+            <w:pPr>
+              <w:spacing w:before="0" w:after="0" w:line="220" w:lineRule="auto"/>
+            </w:pPr>
+            <w:r>
+              <w:rPr>
+                <w:sz w:val="18"/>
+                <w:szCs w:val="18"/>
+              </w:rPr>
+              <w:t>Typ poist. ventilu: {{ safety_valve_type }}    č. PV: {{ safety_valve_number }}</w:t>
+            </w:r>
+          </w:p>
+        </w:tc>
+      </w:tr>
+      <w:tr ns2:paraId="1F80F963" ns2:textId="77777777">
+        <w:tc>
+          <w:tcPr>
+            <w:tcW w:w="10774" w:type="dxa"/>
+            <w:gridSpan w:val="2"/>
+            <w:tcBorders>
+              <w:right w:val="thinThickThinSmallGap" w:sz="24" w:space="0" w:color="D9D9D9" w:themeColor="background1" w:themeShade="D9"/>
+            </w:tcBorders>
+          </w:tcPr>
+          <w:p>
+            <w:pPr>
+              <w:spacing w:before="0" w:after="0" w:line="220" w:lineRule="auto"/>
+            </w:pPr>
+            <w:r>
+              <w:rPr>
+                <w:sz w:val="18"/>
+                <w:szCs w:val="18"/>
+              </w:rPr>
+              <w:t>pretlak: {{ safety_valve_pressure }}    podtlak: {{ vacuum_valve_pressure }}</w:t>
+            </w:r>
+          </w:p>
+        </w:tc>
+      </w:tr>
+      <w:tr ns2:paraId="28CE9335" ns2:textId="77777777">
+        <w:tc>
+          <w:tcPr>
+            <w:tcW w:w="10774" w:type="dxa"/>
+            <w:gridSpan w:val="2"/>
+            <w:tcBorders>
+              <w:right w:val="single" w:sz="12" w:space="0" w:color="D9D9D9" w:themeColor="background1" w:themeShade="D9"/>
             </w:tcBorders>
             <w:shd w:val="clear" w:color="auto" w:fill="D9D9D9" w:themeFill="background1" w:themeFillShade="D9"/>
           </w:tcPr>
-          <w:p ns2:paraId="058C84CB" ns2:textId="77777777">
+          <w:p ns2:paraId="31EC00C4" ns2:textId="77777777">
             <w:pPr>
               <w:spacing w:line="120" w:lineRule="auto"/>
             </w:pPr>
           </w:p>
         </w:tc>
       </w:tr>
-      <w:tr ns2:paraId="69B76A7F" ns2:textId="77777777">
-        <w:tc>
-          <w:tcPr>
-            <w:tcW w:w="5349" w:type="dxa"/>
-            <w:gridSpan w:val="2"/>
-            <w:tcBorders>
-              <w:right w:val="thinThickThinSmallGap" w:sz="24" w:space="0" w:color="D9D9D9" w:themeColor="background1" w:themeShade="D9"/>
-            </w:tcBorders>
-          </w:tcPr>
-          <w:p>
-            <w:pPr>
-              <w:spacing w:before="0" w:after="0" w:line="220" w:lineRule="auto"/>
-            </w:pPr>
-            <w:r>
-              <w:rPr>
-                <w:sz w:val="18"/>
-                <w:szCs w:val="18"/>
-              </w:rPr>
-              <w:t>Vonk. prehliadka: {{ external_inspection_result_label }}    Vnút. prehliadka: {{ internal_inspection_result_label }}</w:t>
-            </w:r>
-          </w:p>
-        </w:tc>
-        <w:tc>
-          <w:tcPr>
-            <w:tcW w:w="5425" w:type="dxa"/>
-            <w:gridSpan w:val="2"/>
-            <w:tcBorders>
-              <w:left w:val="thinThickThinSmallGap" w:sz="24" w:space="0" w:color="D9D9D9" w:themeColor="background1" w:themeShade="D9"/>
-            </w:tcBorders>
-          </w:tcPr>
-          <w:p>
-            <w:pPr>
-              <w:spacing w:before="0" w:after="0" w:line="220" w:lineRule="auto"/>
-            </w:pPr>
-            <w:r>
-              <w:rPr>
-                <w:sz w:val="18"/>
-                <w:szCs w:val="18"/>
-              </w:rPr>
-              <w:t>Vonk. prehliadka: {{ external_inspection_result_label }}    Vnút. prehliadka: {{ internal_inspection_result_label }}</w:t>
-            </w:r>
-          </w:p>
-        </w:tc>
-      </w:tr>
-      <w:tr ns2:paraId="42C00107" ns2:textId="77777777">
-        <w:tc>
-          <w:tcPr>
-            <w:tcW w:w="5349" w:type="dxa"/>
-            <w:gridSpan w:val="2"/>
-            <w:tcBorders>
-              <w:right w:val="thinThickThinSmallGap" w:sz="24" w:space="0" w:color="D9D9D9" w:themeColor="background1" w:themeShade="D9"/>
-            </w:tcBorders>
-          </w:tcPr>
-          <w:p>
-            <w:pPr>
-              <w:spacing w:before="0" w:after="0" w:line="220" w:lineRule="auto"/>
-            </w:pPr>
-            <w:r>
-              <w:rPr>
-                <w:sz w:val="18"/>
-                <w:szCs w:val="18"/>
-              </w:rPr>
-              <w:t>Kontr. zvarov: {{ weld_inspection_result_label }}    Kontr. štítkov: {{ plate_inspection_result_label }}</w:t>
-            </w:r>
-          </w:p>
-        </w:tc>
-        <w:tc>
-          <w:tcPr>
-            <w:tcW w:w="5425" w:type="dxa"/>
-            <w:gridSpan w:val="2"/>
-            <w:tcBorders>
-              <w:left w:val="thinThickThinSmallGap" w:sz="24" w:space="0" w:color="D9D9D9" w:themeColor="background1" w:themeShade="D9"/>
-            </w:tcBorders>
-          </w:tcPr>
-          <w:p>
-            <w:pPr>
-              <w:spacing w:before="0" w:after="0" w:line="220" w:lineRule="auto"/>
-            </w:pPr>
-            <w:r>
-              <w:rPr>
-                <w:sz w:val="18"/>
-                <w:szCs w:val="18"/>
-              </w:rPr>
-              <w:t>Kontr. zvarov: {{ weld_inspection_result_label }}    Kontr. štítkov: {{ plate_inspection_result_label }}</w:t>
-            </w:r>
-          </w:p>
-        </w:tc>
-      </w:tr>
-      <w:tr ns2:paraId="5EB0D813" ns2:textId="77777777">
-        <w:tc>
-          <w:tcPr>
-            <w:tcW w:w="5349" w:type="dxa"/>
-            <w:gridSpan w:val="2"/>
-            <w:tcBorders>
-              <w:right w:val="thinThickThinSmallGap" w:sz="24" w:space="0" w:color="D9D9D9" w:themeColor="background1" w:themeShade="D9"/>
-            </w:tcBorders>
-          </w:tcPr>
-          <w:p>
-            <w:pPr>
-              <w:spacing w:before="0" w:after="0" w:line="220" w:lineRule="auto"/>
-            </w:pPr>
-            <w:r>
-              <w:rPr>
-                <w:sz w:val="18"/>
-                <w:szCs w:val="18"/>
-              </w:rPr>
-              <w:t>Preh. vykur. hadov: vonk. {{ heating_coils_external_result_label }}    vnút. {{ heating_coils_internal_result_label }}</w:t>
-            </w:r>
-          </w:p>
-        </w:tc>
-        <w:tc>
-          <w:tcPr>
-            <w:tcW w:w="5425" w:type="dxa"/>
-            <w:gridSpan w:val="2"/>
-            <w:tcBorders>
-              <w:left w:val="thinThickThinSmallGap" w:sz="24" w:space="0" w:color="D9D9D9" w:themeColor="background1" w:themeShade="D9"/>
-            </w:tcBorders>
-          </w:tcPr>
-          <w:p>
-            <w:pPr>
-              <w:spacing w:before="0" w:after="0" w:line="220" w:lineRule="auto"/>
-            </w:pPr>
-            <w:r>
-              <w:rPr>
-                <w:sz w:val="18"/>
-                <w:szCs w:val="18"/>
-              </w:rPr>
-              <w:t>Preh. vykur. hadov: vonk. {{ heating_coils_external_result_label }}    vnút. {{ heating_coils_internal_result_label }}</w:t>
-            </w:r>
-          </w:p>
-        </w:tc>
-      </w:tr>
-      <w:tr ns2:paraId="74ACAB45" ns2:textId="77777777">
-        <w:tc>
-          <w:tcPr>
-            <w:tcW w:w="5349" w:type="dxa"/>
-            <w:gridSpan w:val="2"/>
-            <w:tcBorders>
-              <w:right w:val="thinThickThinSmallGap" w:sz="24" w:space="0" w:color="D9D9D9" w:themeColor="background1" w:themeShade="D9"/>
-            </w:tcBorders>
-          </w:tcPr>
-          <w:p>
-            <w:pPr>
-              <w:spacing w:before="0" w:after="0" w:line="220" w:lineRule="auto"/>
-            </w:pPr>
-            <w:r>
-              <w:rPr>
-                <w:sz w:val="18"/>
-                <w:szCs w:val="18"/>
-              </w:rPr>
-              <w:t>Bočné (výpus.) ventily: I.str. {{ side_valves_side_1_result_label }}    II.str. {{ side_valves_side_2_result_label }}</w:t>
-            </w:r>
-          </w:p>
-        </w:tc>
-        <w:tc>
-          <w:tcPr>
-            <w:tcW w:w="5425" w:type="dxa"/>
-            <w:gridSpan w:val="2"/>
-            <w:tcBorders>
-              <w:left w:val="thinThickThinSmallGap" w:sz="24" w:space="0" w:color="D9D9D9" w:themeColor="background1" w:themeShade="D9"/>
-            </w:tcBorders>
-          </w:tcPr>
-          <w:p>
-            <w:pPr>
-              <w:spacing w:before="0" w:after="0" w:line="220" w:lineRule="auto"/>
-            </w:pPr>
-            <w:r>
-              <w:rPr>
-                <w:sz w:val="18"/>
-                <w:szCs w:val="18"/>
-              </w:rPr>
-              <w:t>Bočné (výpus.) ventily: I.str. {{ side_valves_side_1_result_label }}    II.str. {{ side_valves_side_2_result_label }}</w:t>
-            </w:r>
-          </w:p>
-        </w:tc>
-      </w:tr>
-      <w:tr ns2:paraId="51136AE0" ns2:textId="77777777">
-        <w:tc>
-          <w:tcPr>
-            <w:tcW w:w="5349" w:type="dxa"/>
-            <w:gridSpan w:val="2"/>
-            <w:tcBorders>
-              <w:right w:val="thinThickThinSmallGap" w:sz="24" w:space="0" w:color="D9D9D9" w:themeColor="background1" w:themeShade="D9"/>
-            </w:tcBorders>
-          </w:tcPr>
-          <w:p>
-            <w:pPr>
-              <w:spacing w:before="0" w:after="0" w:line="220" w:lineRule="auto"/>
-            </w:pPr>
-            <w:r>
-              <w:rPr>
-                <w:sz w:val="18"/>
-                <w:szCs w:val="18"/>
-              </w:rPr>
-              <w:t>Stredový ventil: {{ center_valve_result_label }}</w:t>
-            </w:r>
-          </w:p>
-        </w:tc>
-        <w:tc>
-          <w:tcPr>
-            <w:tcW w:w="5425" w:type="dxa"/>
-            <w:gridSpan w:val="2"/>
-            <w:tcBorders>
-              <w:left w:val="thinThickThinSmallGap" w:sz="24" w:space="0" w:color="D9D9D9" w:themeColor="background1" w:themeShade="D9"/>
-            </w:tcBorders>
-          </w:tcPr>
-          <w:p>
-            <w:pPr>
-              <w:spacing w:before="0" w:after="0" w:line="220" w:lineRule="auto"/>
-            </w:pPr>
-            <w:r>
-              <w:rPr>
-                <w:sz w:val="18"/>
-                <w:szCs w:val="18"/>
-              </w:rPr>
-              <w:t>Stredový ventil: {{ center_valve_result_label }}</w:t>
-            </w:r>
-          </w:p>
-        </w:tc>
-      </w:tr>
-      <w:tr ns2:paraId="625DA006" ns2:textId="77777777">
-        <w:tc>
-          <w:tcPr>
-            <w:tcW w:w="5349" w:type="dxa"/>
-            <w:gridSpan w:val="2"/>
-            <w:tcBorders>
-              <w:right w:val="thinThickThinSmallGap" w:sz="24" w:space="0" w:color="D9D9D9" w:themeColor="background1" w:themeShade="D9"/>
-            </w:tcBorders>
-          </w:tcPr>
-          <w:p>
-            <w:pPr>
-              <w:spacing w:before="0" w:after="0" w:line="220" w:lineRule="auto"/>
-            </w:pPr>
-            <w:r>
-              <w:rPr>
-                <w:sz w:val="18"/>
-                <w:szCs w:val="18"/>
-              </w:rPr>
-              <w:t>veko + tesnenie: {{ lid_gasket_result_label }}</w:t>
-            </w:r>
-          </w:p>
-        </w:tc>
-        <w:tc>
-          <w:tcPr>
-            <w:tcW w:w="5425" w:type="dxa"/>
-            <w:gridSpan w:val="2"/>
-            <w:tcBorders>
-              <w:left w:val="thinThickThinSmallGap" w:sz="24" w:space="0" w:color="D9D9D9" w:themeColor="background1" w:themeShade="D9"/>
-            </w:tcBorders>
-          </w:tcPr>
-          <w:p>
-            <w:pPr>
-              <w:spacing w:before="0" w:after="0" w:line="220" w:lineRule="auto"/>
-            </w:pPr>
-            <w:r>
-              <w:rPr>
-                <w:sz w:val="18"/>
-                <w:szCs w:val="18"/>
-              </w:rPr>
-              <w:t>veko + tesnenie: {{ lid_gasket_result_label }}</w:t>
-            </w:r>
-          </w:p>
-        </w:tc>
-      </w:tr>
-      <w:tr ns2:paraId="0776AD60" ns2:textId="77777777">
-        <w:tc>
-          <w:tcPr>
-            <w:tcW w:w="5349" w:type="dxa"/>
-            <w:gridSpan w:val="2"/>
-            <w:tcBorders>
-              <w:right w:val="thinThickThinSmallGap" w:sz="24" w:space="0" w:color="D9D9D9" w:themeColor="background1" w:themeShade="D9"/>
-            </w:tcBorders>
-          </w:tcPr>
-          <w:p>
-            <w:pPr>
-              <w:spacing w:before="0" w:after="0" w:line="220" w:lineRule="auto"/>
-            </w:pPr>
-            <w:r>
-              <w:rPr>
-                <w:sz w:val="18"/>
-                <w:szCs w:val="18"/>
-              </w:rPr>
-              <w:t>Typ poist. ventilu: {{ safety_valve_type }}    č. PV: {{ safety_valve_number }}</w:t>
-            </w:r>
-          </w:p>
-        </w:tc>
-        <w:tc>
-          <w:tcPr>
-            <w:tcW w:w="5425" w:type="dxa"/>
-            <w:gridSpan w:val="2"/>
-            <w:tcBorders>
-              <w:left w:val="thinThickThinSmallGap" w:sz="24" w:space="0" w:color="D9D9D9" w:themeColor="background1" w:themeShade="D9"/>
-            </w:tcBorders>
-          </w:tcPr>
-          <w:p>
-            <w:pPr>
-              <w:spacing w:before="0" w:after="0" w:line="220" w:lineRule="auto"/>
-            </w:pPr>
-            <w:r>
-              <w:rPr>
-                <w:sz w:val="18"/>
-                <w:szCs w:val="18"/>
-              </w:rPr>
-              <w:t>Typ poist. ventilu: {{ safety_valve_type }}    č. PV: {{ safety_valve_number }}</w:t>
-            </w:r>
-          </w:p>
-        </w:tc>
-      </w:tr>
-      <w:tr ns2:paraId="1F80F963" ns2:textId="77777777">
-        <w:tc>
-          <w:tcPr>
-            <w:tcW w:w="5349" w:type="dxa"/>
-            <w:gridSpan w:val="2"/>
-            <w:tcBorders>
-              <w:right w:val="thinThickThinSmallGap" w:sz="24" w:space="0" w:color="D9D9D9" w:themeColor="background1" w:themeShade="D9"/>
-            </w:tcBorders>
-          </w:tcPr>
-          <w:p>
-            <w:pPr>
-              <w:spacing w:before="0" w:after="0" w:line="220" w:lineRule="auto"/>
-            </w:pPr>
-            <w:r>
-              <w:rPr>
-                <w:sz w:val="18"/>
-                <w:szCs w:val="18"/>
-              </w:rPr>
-              <w:t>pretlak: {{ safety_valve_pressure }}    podtlak: {{ vacuum_valve_pressure }}</w:t>
-            </w:r>
-          </w:p>
-        </w:tc>
-        <w:tc>
-          <w:tcPr>
-            <w:tcW w:w="5425" w:type="dxa"/>
-            <w:gridSpan w:val="2"/>
-            <w:tcBorders>
-              <w:left w:val="thinThickThinSmallGap" w:sz="24" w:space="0" w:color="D9D9D9" w:themeColor="background1" w:themeShade="D9"/>
-            </w:tcBorders>
-          </w:tcPr>
-          <w:p>
-            <w:pPr>
-              <w:spacing w:before="0" w:after="0" w:line="220" w:lineRule="auto"/>
-            </w:pPr>
-            <w:r>
-              <w:rPr>
-                <w:sz w:val="18"/>
-                <w:szCs w:val="18"/>
-              </w:rPr>
-              <w:t>pretlak: {{ safety_valve_pressure }}    podtlak: {{ vacuum_valve_pressure }}</w:t>
-            </w:r>
-          </w:p>
-        </w:tc>
-      </w:tr>
-      <w:tr ns2:paraId="28CE9335" ns2:textId="77777777">
-        <w:tc>
-          <w:tcPr>
-            <w:tcW w:w="5349" w:type="dxa"/>
+      <w:tr ns2:paraId="49E199B8" ns2:textId="77777777">
+        <w:tc>
+          <w:tcPr>
+            <w:tcW w:w="10774" w:type="dxa"/>
+            <w:gridSpan w:val="2"/>
+            <w:tcBorders>
+              <w:right w:val="thinThickThinSmallGap" w:sz="24" w:space="0" w:color="D9D9D9" w:themeColor="background1" w:themeShade="D9"/>
+            </w:tcBorders>
+          </w:tcPr>
+          <w:p>
+            <w:pPr>
+              <w:spacing w:before="0" w:after="0" w:line="220" w:lineRule="auto"/>
+            </w:pPr>
+            <w:r>
+              <w:rPr>
+                <w:sz w:val="18"/>
+                <w:szCs w:val="18"/>
+              </w:rPr>
+              <w:t>Uzemnenie: {{ grounding_result_label }}</w:t>
+            </w:r>
+          </w:p>
+        </w:tc>
+      </w:tr>
+      <w:tr ns2:paraId="09ADF54D" ns2:textId="77777777">
+        <w:tc>
+          <w:tcPr>
+            <w:tcW w:w="10774" w:type="dxa"/>
+            <w:gridSpan w:val="2"/>
+            <w:tcBorders>
+              <w:right w:val="thinThickThinSmallGap" w:sz="24" w:space="0" w:color="D9D9D9" w:themeColor="background1" w:themeShade="D9"/>
+            </w:tcBorders>
+          </w:tcPr>
+          <w:p>
+            <w:pPr>
+              <w:spacing w:before="0" w:after="0" w:line="220" w:lineRule="auto"/>
+            </w:pPr>
+            <w:r>
+              <w:rPr>
+                <w:sz w:val="18"/>
+                <w:szCs w:val="18"/>
+              </w:rPr>
+              <w:t>Protokol UTT: {{ utt_protocol_number }}    Protokol gum.: {{ rubber_protocol_number }}</w:t>
+            </w:r>
+          </w:p>
+        </w:tc>
+      </w:tr>
+      <w:tr ns2:paraId="31734B7B" ns2:textId="77777777">
+        <w:tc>
+          <w:tcPr>
+            <w:tcW w:w="10774" w:type="dxa"/>
+            <w:gridSpan w:val="2"/>
+            <w:tcBorders>
+              <w:right w:val="thinThickThinSmallGap" w:sz="24" w:space="0" w:color="D9D9D9" w:themeColor="background1" w:themeShade="D9"/>
+            </w:tcBorders>
+          </w:tcPr>
+          <w:p>
+            <w:pPr>
+              <w:spacing w:before="0" w:after="0" w:line="220" w:lineRule="auto"/>
+            </w:pPr>
+            <w:r>
+              <w:rPr>
+                <w:sz w:val="18"/>
+                <w:szCs w:val="18"/>
+              </w:rPr>
+              <w:t>Nameraná min. hrúbka kotla:</w:t>
+            </w:r>
+          </w:p>
+        </w:tc>
+      </w:tr>
+      <w:tr ns2:paraId="595C5D5D" ns2:textId="77777777">
+        <w:tc>
+          <w:tcPr>
+            <w:tcW w:w="5387" w:type="dxa"/>
+          </w:tcPr>
+          <w:p>
+            <w:pPr>
+              <w:spacing w:before="0" w:after="0" w:line="220" w:lineRule="auto"/>
+            </w:pPr>
+            <w:r>
+              <w:rPr>
+                <w:sz w:val="18"/>
+                <w:szCs w:val="18"/>
+              </w:rPr>
+              <w:t>čelá: {{ measured_wall_thickness_front_mm }} mm</w:t>
+            </w:r>
+          </w:p>
+        </w:tc>
+        <w:tc>
+          <w:tcPr>
+            <w:tcW w:w="5387" w:type="dxa"/>
+            <w:tcBorders>
+              <w:right w:val="thinThickThinSmallGap" w:sz="24" w:space="0" w:color="D9D9D9" w:themeColor="background1" w:themeShade="D9"/>
+            </w:tcBorders>
+          </w:tcPr>
+          <w:p>
+            <w:pPr>
+              <w:spacing w:before="0" w:after="0" w:line="220" w:lineRule="auto"/>
+            </w:pPr>
+            <w:r>
+              <w:rPr>
+                <w:sz w:val="18"/>
+                <w:szCs w:val="18"/>
+              </w:rPr>
+              <w:t>luby: {{ measured_wall_thickness_shell_mm }} mm</w:t>
+            </w:r>
+          </w:p>
+        </w:tc>
+      </w:tr>
+      <w:tr ns2:paraId="3212FAF4" ns2:textId="77777777">
+        <w:tc>
+          <w:tcPr>
+            <w:tcW w:w="10774" w:type="dxa"/>
             <w:gridSpan w:val="2"/>
             <w:tcBorders>
               <w:right w:val="single" w:sz="12" w:space="0" w:color="D9D9D9" w:themeColor="background1" w:themeShade="D9"/>
             </w:tcBorders>
             <w:shd w:val="clear" w:color="auto" w:fill="D9D9D9" w:themeFill="background1" w:themeFillShade="D9"/>
           </w:tcPr>
-          <w:p ns2:paraId="31EC00C4" ns2:textId="77777777">
+          <w:p ns2:paraId="4776AF19" ns2:textId="3398CE09">
             <w:pPr>
               <w:spacing w:line="120" w:lineRule="auto"/>
             </w:pPr>
-          </w:p>
-        </w:tc>
-        <w:tc>
-          <w:tcPr>
-            <w:tcW w:w="5425" w:type="dxa"/>
-            <w:gridSpan w:val="2"/>
-            <w:tcBorders>
-              <w:left w:val="single" w:sz="12" w:space="0" w:color="D9D9D9" w:themeColor="background1" w:themeShade="D9"/>
-            </w:tcBorders>
-            <w:shd w:val="clear" w:color="auto" w:fill="D9D9D9" w:themeFill="background1" w:themeFillShade="D9"/>
-          </w:tcPr>
-          <w:p ns2:paraId="45E622B7" ns2:textId="77777777">
-            <w:pPr>
-              <w:spacing w:line="120" w:lineRule="auto"/>
-            </w:pPr>
-          </w:p>
-        </w:tc>
-      </w:tr>
-      <w:tr ns2:paraId="49E199B8" ns2:textId="77777777">
-        <w:tc>
-          <w:tcPr>
-            <w:tcW w:w="5349" w:type="dxa"/>
-            <w:gridSpan w:val="2"/>
-            <w:tcBorders>
-              <w:right w:val="thinThickThinSmallGap" w:sz="24" w:space="0" w:color="D9D9D9" w:themeColor="background1" w:themeShade="D9"/>
-            </w:tcBorders>
-          </w:tcPr>
-          <w:p>
-            <w:pPr>
-              <w:spacing w:before="0" w:after="0" w:line="220" w:lineRule="auto"/>
-            </w:pPr>
-            <w:r>
-              <w:rPr>
-                <w:sz w:val="18"/>
-                <w:szCs w:val="18"/>
-              </w:rPr>
-              <w:t>Uzemnenie: {{ grounding_result_label }}</w:t>
-            </w:r>
-          </w:p>
-        </w:tc>
-        <w:tc>
-          <w:tcPr>
-            <w:tcW w:w="5425" w:type="dxa"/>
-            <w:gridSpan w:val="2"/>
-            <w:tcBorders>
-              <w:left w:val="thinThickThinSmallGap" w:sz="24" w:space="0" w:color="D9D9D9" w:themeColor="background1" w:themeShade="D9"/>
-            </w:tcBorders>
-          </w:tcPr>
-          <w:p>
-            <w:pPr>
-              <w:spacing w:before="0" w:after="0" w:line="220" w:lineRule="auto"/>
-            </w:pPr>
-            <w:r>
-              <w:rPr>
-                <w:sz w:val="18"/>
-                <w:szCs w:val="18"/>
-              </w:rPr>
-              <w:t>Uzemnenie: {{ grounding_result_label }}</w:t>
-            </w:r>
-          </w:p>
-        </w:tc>
-      </w:tr>
-      <w:tr ns2:paraId="09ADF54D" ns2:textId="77777777">
-        <w:tc>
-          <w:tcPr>
-            <w:tcW w:w="5349" w:type="dxa"/>
-            <w:gridSpan w:val="2"/>
-            <w:tcBorders>
-              <w:right w:val="thinThickThinSmallGap" w:sz="24" w:space="0" w:color="D9D9D9" w:themeColor="background1" w:themeShade="D9"/>
-            </w:tcBorders>
-          </w:tcPr>
-          <w:p>
-            <w:pPr>
-              <w:spacing w:before="0" w:after="0" w:line="220" w:lineRule="auto"/>
-            </w:pPr>
-            <w:r>
-              <w:rPr>
-                <w:sz w:val="18"/>
-                <w:szCs w:val="18"/>
-              </w:rPr>
-              <w:t>Protokol UTT: {{ utt_protocol_number }}    Protokol gum.: {{ rubber_protocol_number }}</w:t>
-            </w:r>
-          </w:p>
-        </w:tc>
-        <w:tc>
-          <w:tcPr>
-            <w:tcW w:w="5425" w:type="dxa"/>
-            <w:gridSpan w:val="2"/>
-            <w:tcBorders>
-              <w:left w:val="thinThickThinSmallGap" w:sz="24" w:space="0" w:color="D9D9D9" w:themeColor="background1" w:themeShade="D9"/>
-            </w:tcBorders>
-          </w:tcPr>
-          <w:p>
-            <w:pPr>
-              <w:spacing w:before="0" w:after="0" w:line="220" w:lineRule="auto"/>
-            </w:pPr>
-            <w:r>
-              <w:rPr>
-                <w:sz w:val="18"/>
-                <w:szCs w:val="18"/>
-              </w:rPr>
-              <w:t>Protokol UTT: {{ utt_protocol_number }}    Protokol gum.: {{ rubber_protocol_number }}</w:t>
-            </w:r>
-          </w:p>
-        </w:tc>
-      </w:tr>
-      <w:tr ns2:paraId="31734B7B" ns2:textId="77777777">
-        <w:tc>
-          <w:tcPr>
-            <w:tcW w:w="5349" w:type="dxa"/>
-            <w:gridSpan w:val="2"/>
-            <w:tcBorders>
-              <w:right w:val="thinThickThinSmallGap" w:sz="24" w:space="0" w:color="D9D9D9" w:themeColor="background1" w:themeShade="D9"/>
-            </w:tcBorders>
-          </w:tcPr>
-          <w:p>
-            <w:pPr>
-              <w:spacing w:before="0" w:after="0" w:line="220" w:lineRule="auto"/>
-            </w:pPr>
-            <w:r>
-              <w:rPr>
-                <w:sz w:val="18"/>
-                <w:szCs w:val="18"/>
-              </w:rPr>
-              <w:t>Nameraná min. hrúbka kotla:</w:t>
-            </w:r>
-          </w:p>
-        </w:tc>
-        <w:tc>
-          <w:tcPr>
-            <w:tcW w:w="5425" w:type="dxa"/>
-            <w:gridSpan w:val="2"/>
-            <w:tcBorders>
-              <w:left w:val="thinThickThinSmallGap" w:sz="24" w:space="0" w:color="D9D9D9" w:themeColor="background1" w:themeShade="D9"/>
-            </w:tcBorders>
-          </w:tcPr>
-          <w:p>
-            <w:pPr>
-              <w:spacing w:before="0" w:after="0" w:line="220" w:lineRule="auto"/>
-            </w:pPr>
-            <w:r>
-              <w:rPr>
-                <w:sz w:val="18"/>
-                <w:szCs w:val="18"/>
-              </w:rPr>
-              <w:t>Nameraná min. hrúbka kotla:</w:t>
-            </w:r>
-          </w:p>
-        </w:tc>
-      </w:tr>
-      <w:tr ns2:paraId="595C5D5D" ns2:textId="77777777">
-        <w:tc>
-          <w:tcPr>
-            <w:tcW w:w="2674" w:type="dxa"/>
-          </w:tcPr>
-          <w:p>
-            <w:pPr>
-              <w:spacing w:before="0" w:after="0" w:line="220" w:lineRule="auto"/>
-            </w:pPr>
-            <w:r>
-              <w:rPr>
-                <w:sz w:val="18"/>
-                <w:szCs w:val="18"/>
-              </w:rPr>
-              <w:t>čelá: {{ measured_wall_thickness_front_mm }} mm</w:t>
-            </w:r>
-          </w:p>
-        </w:tc>
-        <w:tc>
-          <w:tcPr>
-            <w:tcW w:w="2675" w:type="dxa"/>
-            <w:tcBorders>
-              <w:right w:val="thinThickThinSmallGap" w:sz="24" w:space="0" w:color="D9D9D9" w:themeColor="background1" w:themeShade="D9"/>
-            </w:tcBorders>
-          </w:tcPr>
-          <w:p>
-            <w:pPr>
-              <w:spacing w:before="0" w:after="0" w:line="220" w:lineRule="auto"/>
-            </w:pPr>
-            <w:r>
-              <w:rPr>
-                <w:sz w:val="18"/>
-                <w:szCs w:val="18"/>
-              </w:rPr>
-              <w:t>luby: {{ measured_wall_thickness_shell_mm }} mm</w:t>
-            </w:r>
-          </w:p>
-        </w:tc>
-        <w:tc>
-          <w:tcPr>
-            <w:tcW w:w="2712" w:type="dxa"/>
-            <w:tcBorders>
-              <w:left w:val="thinThickThinSmallGap" w:sz="24" w:space="0" w:color="D9D9D9" w:themeColor="background1" w:themeShade="D9"/>
-            </w:tcBorders>
-          </w:tcPr>
-          <w:p>
-            <w:pPr>
-              <w:spacing w:before="0" w:after="0" w:line="220" w:lineRule="auto"/>
-            </w:pPr>
-            <w:r>
-              <w:rPr>
-                <w:sz w:val="18"/>
-                <w:szCs w:val="18"/>
-              </w:rPr>
-              <w:t>čelá: {{ measured_wall_thickness_front_mm }} mm</w:t>
-            </w:r>
-          </w:p>
-        </w:tc>
-        <w:tc>
-          <w:tcPr>
-            <w:tcW w:w="2713" w:type="dxa"/>
-          </w:tcPr>
-          <w:p>
-            <w:pPr>
-              <w:spacing w:before="0" w:after="0" w:line="220" w:lineRule="auto"/>
-            </w:pPr>
-            <w:r>
-              <w:rPr>
-                <w:sz w:val="18"/>
-                <w:szCs w:val="18"/>
-              </w:rPr>
-              <w:t>luby: {{ measured_wall_thickness_shell_mm }} mm</w:t>
-            </w:r>
-          </w:p>
-        </w:tc>
-      </w:tr>
-      <w:tr ns2:paraId="3212FAF4" ns2:textId="77777777">
-        <w:tc>
-          <w:tcPr>
-            <w:tcW w:w="5349" w:type="dxa"/>
-            <w:gridSpan w:val="2"/>
-            <w:tcBorders>
-              <w:right w:val="single" w:sz="12" w:space="0" w:color="D9D9D9" w:themeColor="background1" w:themeShade="D9"/>
-            </w:tcBorders>
-            <w:shd w:val="clear" w:color="auto" w:fill="D9D9D9" w:themeFill="background1" w:themeFillShade="D9"/>
-          </w:tcPr>
-          <w:p ns2:paraId="4776AF19" ns2:textId="3398CE09">
-            <w:pPr>
-              <w:spacing w:line="120" w:lineRule="auto"/>
-            </w:pPr>
             <w:r>
               <w:t xml:space="preserve">          </w:t>
             </w:r>
           </w:p>
         </w:tc>
-        <w:tc>
-          <w:tcPr>
-            <w:tcW w:w="5425" w:type="dxa"/>
-            <w:gridSpan w:val="2"/>
-            <w:tcBorders>
-              <w:left w:val="single" w:sz="12" w:space="0" w:color="D9D9D9" w:themeColor="background1" w:themeShade="D9"/>
-            </w:tcBorders>
-            <w:shd w:val="clear" w:color="auto" w:fill="D9D9D9" w:themeFill="background1" w:themeFillShade="D9"/>
-          </w:tcPr>
-          <w:p ns2:paraId="2F2824A8" ns2:textId="77777777">
-            <w:pPr>
-              <w:spacing w:line="120" w:lineRule="auto"/>
-            </w:pPr>
-          </w:p>
-        </w:tc>
       </w:tr>
       <w:tr ns2:paraId="5A5A8393" ns2:textId="77777777">
         <w:tc>
           <w:tcPr>
-            <w:tcW w:w="5349" w:type="dxa"/>
+            <w:tcW w:w="10774" w:type="dxa"/>
             <w:gridSpan w:val="2"/>
             <w:tcBorders>
               <w:right w:val="thinThickThinSmallGap" w:sz="24" w:space="0" w:color="D9D9D9" w:themeColor="background1" w:themeShade="D9"/>
@@ -1628,32 +884,11 @@
             </w:r>
           </w:p>
         </w:tc>
-        <w:tc>
-          <w:tcPr>
-            <w:tcW w:w="5425" w:type="dxa"/>
-            <w:gridSpan w:val="2"/>
-            <w:tcBorders>
-              <w:left w:val="thinThickThinSmallGap" w:sz="24" w:space="0" w:color="D9D9D9" w:themeColor="background1" w:themeShade="D9"/>
-            </w:tcBorders>
-          </w:tcPr>
-          <w:p>
-            <w:pPr>
-              <w:spacing w:before="0" w:after="0" w:line="220" w:lineRule="auto"/>
-            </w:pPr>
-            <w:r>
-              <w:rPr>
-                <w:sz w:val="18"/>
-                <w:szCs w:val="18"/>
-              </w:rPr>
-              <w:t>Orazenie štítka: {{ tank_plate_stamp }}</w:t>
-            </w:r>
-          </w:p>
-        </w:tc>
       </w:tr>
       <w:tr ns2:paraId="6ED91639" ns2:textId="77777777">
         <w:tc>
           <w:tcPr>
-            <w:tcW w:w="5349" w:type="dxa"/>
+            <w:tcW w:w="10774" w:type="dxa"/>
             <w:gridSpan w:val="2"/>
             <w:tcBorders>
               <w:right w:val="thinThickThinSmallGap" w:sz="24" w:space="0" w:color="D9D9D9" w:themeColor="background1" w:themeShade="D9"/>
@@ -1672,32 +907,11 @@
             </w:r>
           </w:p>
         </w:tc>
-        <w:tc>
-          <w:tcPr>
-            <w:tcW w:w="5425" w:type="dxa"/>
-            <w:gridSpan w:val="2"/>
-            <w:tcBorders>
-              <w:left w:val="thinThickThinSmallGap" w:sz="24" w:space="0" w:color="D9D9D9" w:themeColor="background1" w:themeShade="D9"/>
-            </w:tcBorders>
-          </w:tcPr>
-          <w:p>
-            <w:pPr>
-              <w:spacing w:before="0" w:after="0" w:line="220" w:lineRule="auto"/>
-            </w:pPr>
-            <w:r>
-              <w:rPr>
-                <w:sz w:val="18"/>
-                <w:szCs w:val="18"/>
-              </w:rPr>
-              <w:t>Budúca skúška: {{ next_inspection }}</w:t>
-            </w:r>
-          </w:p>
-        </w:tc>
       </w:tr>
       <w:tr ns2:paraId="7C8121D4" ns2:textId="77777777">
         <w:tc>
           <w:tcPr>
-            <w:tcW w:w="5349" w:type="dxa"/>
+            <w:tcW w:w="10774" w:type="dxa"/>
             <w:gridSpan w:val="2"/>
             <w:tcBorders>
               <w:right w:val="thinThickThinSmallGap" w:sz="24" w:space="0" w:color="D9D9D9" w:themeColor="background1" w:themeShade="D9"/>
@@ -1716,32 +930,11 @@
             </w:r>
           </w:p>
         </w:tc>
-        <w:tc>
-          <w:tcPr>
-            <w:tcW w:w="5425" w:type="dxa"/>
-            <w:gridSpan w:val="2"/>
-            <w:tcBorders>
-              <w:left w:val="thinThickThinSmallGap" w:sz="24" w:space="0" w:color="D9D9D9" w:themeColor="background1" w:themeShade="D9"/>
-            </w:tcBorders>
-          </w:tcPr>
-          <w:p>
-            <w:pPr>
-              <w:spacing w:before="0" w:after="0" w:line="220" w:lineRule="auto"/>
-            </w:pPr>
-            <w:r>
-              <w:rPr>
-                <w:sz w:val="18"/>
-                <w:szCs w:val="18"/>
-              </w:rPr>
-              <w:t>Zvláštne ustanovenia: {{ special_provisions }}</w:t>
-            </w:r>
-          </w:p>
-        </w:tc>
       </w:tr>
       <w:tr ns2:paraId="352B42C5" ns2:textId="77777777">
         <w:tc>
           <w:tcPr>
-            <w:tcW w:w="5349" w:type="dxa"/>
+            <w:tcW w:w="10774" w:type="dxa"/>
             <w:gridSpan w:val="2"/>
             <w:tcBorders>
               <w:right w:val="thinThickThinSmallGap" w:sz="24" w:space="0" w:color="D9D9D9" w:themeColor="background1" w:themeShade="D9"/>
@@ -1760,57 +953,14 @@
             </w:r>
           </w:p>
         </w:tc>
-        <w:tc>
-          <w:tcPr>
-            <w:tcW w:w="5425" w:type="dxa"/>
-            <w:gridSpan w:val="2"/>
-            <w:tcBorders>
-              <w:left w:val="thinThickThinSmallGap" w:sz="24" w:space="0" w:color="D9D9D9" w:themeColor="background1" w:themeShade="D9"/>
-            </w:tcBorders>
-          </w:tcPr>
-          <w:p>
-            <w:pPr>
-              <w:spacing w:before="0" w:after="0" w:line="220" w:lineRule="auto"/>
-            </w:pPr>
-            <w:r>
-              <w:rPr>
-                <w:sz w:val="18"/>
-                <w:szCs w:val="18"/>
-              </w:rPr>
-              <w:t>č. mer. + kal. do: {{ measuring_device_number }} / {{ calibration_valid_until }}</w:t>
-            </w:r>
-          </w:p>
-        </w:tc>
       </w:tr>
       <w:tr ns2:paraId="4345058A" ns2:textId="77777777">
         <w:tc>
           <w:tcPr>
-            <w:tcW w:w="5349" w:type="dxa"/>
-            <w:gridSpan w:val="2"/>
-            <w:tcBorders>
-              <w:right w:val="thinThickThinSmallGap" w:sz="24" w:space="0" w:color="D9D9D9" w:themeColor="background1" w:themeShade="D9"/>
-            </w:tcBorders>
-            <w:vAlign w:val="center"/>
-          </w:tcPr>
-          <w:p>
-            <w:pPr>
-              <w:spacing w:before="0" w:after="0" w:line="220" w:lineRule="auto"/>
-            </w:pPr>
-            <w:r>
-              <w:rPr>
-                <w:sz w:val="18"/>
-                <w:szCs w:val="18"/>
-              </w:rPr>
-              <w:t>Čas trvania skúšky: {{ test_duration }}</w:t>
-            </w:r>
-          </w:p>
-        </w:tc>
-        <w:tc>
-          <w:tcPr>
-            <w:tcW w:w="5425" w:type="dxa"/>
-            <w:gridSpan w:val="2"/>
-            <w:tcBorders>
-              <w:left w:val="thinThickThinSmallGap" w:sz="24" w:space="0" w:color="D9D9D9" w:themeColor="background1" w:themeShade="D9"/>
+            <w:tcW w:w="10774" w:type="dxa"/>
+            <w:gridSpan w:val="2"/>
+            <w:tcBorders>
+              <w:right w:val="thinThickThinSmallGap" w:sz="24" w:space="0" w:color="D9D9D9" w:themeColor="background1" w:themeShade="D9"/>
             </w:tcBorders>
             <w:vAlign w:val="center"/>
           </w:tcPr>
@@ -1834,57 +984,10 @@
         </w:trPr>
         <w:tc>
           <w:tcPr>
-            <w:tcW w:w="5349" w:type="dxa"/>
-            <w:gridSpan w:val="2"/>
-            <w:tcBorders>
-              <w:right w:val="thinThickThinSmallGap" w:sz="24" w:space="0" w:color="D9D9D9" w:themeColor="background1" w:themeShade="D9"/>
-            </w:tcBorders>
-          </w:tcPr>
-          <w:p>
-            <w:pPr>
-              <w:spacing w:before="0" w:after="0" w:line="220" w:lineRule="auto"/>
-            </w:pPr>
-            <w:r>
-              <w:rPr>
-                <w:sz w:val="18"/>
-                <w:szCs w:val="18"/>
-              </w:rPr>
-              <w:t>Poznámky:</w:t>
-              <w:br/>
-            </w:r>
-          </w:p>
-          <w:p>
-            <w:pPr>
-              <w:spacing w:before="0" w:after="0" w:line="220" w:lineRule="auto"/>
-            </w:pPr>
-            <w:r>
-              <w:rPr>
-                <w:sz w:val="18"/>
-                <w:szCs w:val="18"/>
-              </w:rPr>
-              <w:t>{{ remarks }}</w:t>
-              <w:br/>
-            </w:r>
-          </w:p>
-          <w:p>
-            <w:pPr>
-              <w:spacing w:before="0" w:after="0" w:line="220" w:lineRule="auto"/>
-            </w:pPr>
-            <w:r>
-              <w:rPr>
-                <w:sz w:val="18"/>
-                <w:szCs w:val="18"/>
-              </w:rPr>
-              <w:t>Dôvod mimoriadnej kontroly: {{ extraordinary_inspection_reason }}</w:t>
-            </w:r>
-          </w:p>
-        </w:tc>
-        <w:tc>
-          <w:tcPr>
-            <w:tcW w:w="5425" w:type="dxa"/>
-            <w:gridSpan w:val="2"/>
-            <w:tcBorders>
-              <w:left w:val="thinThickThinSmallGap" w:sz="24" w:space="0" w:color="D9D9D9" w:themeColor="background1" w:themeShade="D9"/>
+            <w:tcW w:w="10774" w:type="dxa"/>
+            <w:gridSpan w:val="2"/>
+            <w:tcBorders>
+              <w:right w:val="thinThickThinSmallGap" w:sz="24" w:space="0" w:color="D9D9D9" w:themeColor="background1" w:themeShade="D9"/>
             </w:tcBorders>
           </w:tcPr>
           <w:p>
@@ -1938,17 +1041,18 @@
         <w:tblLook w:val="04A0" w:firstRow="1" w:lastRow="0" w:firstColumn="1" w:lastColumn="0" w:noHBand="0" w:noVBand="1"/>
       </w:tblPr>
       <w:tblGrid>
-        <w:gridCol w:w="5349"/>
-        <w:gridCol w:w="5425"/>
+        <w:gridCol w:w="5387"/>
+        <w:gridCol w:w="5387"/>
       </w:tblGrid>
       <w:tr ns2:paraId="77236731" ns2:textId="77777777">
         <w:tc>
           <w:tcPr>
-            <w:tcW w:w="5349" w:type="dxa"/>
+            <w:tcW w:w="10774" w:type="dxa"/>
             <w:tcBorders>
               <w:right w:val="thinThickThinSmallGap" w:sz="24" w:space="0" w:color="D9D9D9" w:themeColor="background1" w:themeShade="D9"/>
             </w:tcBorders>
             <w:shd w:val="clear" w:color="auto" w:fill="D9D9D9" w:themeFill="background1" w:themeFillShade="D9"/>
+            <w:gridSpan w:val="2"/>
           </w:tcPr>
           <w:p ns2:paraId="4278DB7D" ns2:textId="2430BB94">
             <w:pPr>
@@ -1979,63 +1083,16 @@
             </w:r>
           </w:p>
         </w:tc>
-        <w:tc>
-          <w:tcPr>
-            <w:tcW w:w="5425" w:type="dxa"/>
-            <w:tcBorders>
-              <w:left w:val="thinThickThinSmallGap" w:sz="24" w:space="0" w:color="D9D9D9" w:themeColor="background1" w:themeShade="D9"/>
-            </w:tcBorders>
-            <w:shd w:val="clear" w:color="auto" w:fill="D9D9D9" w:themeFill="background1" w:themeFillShade="D9"/>
-          </w:tcPr>
-          <w:p ns2:paraId="318930D7" ns2:textId="7C98EA2A">
-            <w:pPr>
-              <w:spacing w:line="300" w:lineRule="auto"/>
-              <w:jc w:val="center"/>
-            </w:pPr>
-            <w:r>
-              <w:rPr>
-                <w:rFonts w:ascii="Calibri" w:eastAsia="Times New Roman" w:hAnsi="Calibri" w:cs="Calibri"/>
-                <w:b/>
-                <w:bCs/>
-                <w:color w:val="000000"/>
-                <w:sz w:val="18"/>
-                <w:szCs w:val="18"/>
-              </w:rPr>
-              <w:t>Preskúmanie sp</w:t>
-            </w:r>
-            <w:r>
-              <w:rPr>
-                <w:rFonts w:ascii="Calibri" w:eastAsia="Times New Roman" w:hAnsi="Calibri" w:cs="Calibri"/>
-                <w:b/>
-                <w:bCs/>
-                <w:color w:val="000000"/>
-                <w:sz w:val="18"/>
-                <w:szCs w:val="18"/>
-              </w:rPr>
-              <w:t>ôsobilosti dodávateľa</w:t>
-            </w:r>
-            <w:r>
-              <w:rPr>
-                <w:rFonts w:ascii="Calibri" w:eastAsia="Times New Roman" w:hAnsi="Calibri" w:cs="Calibri"/>
-                <w:b/>
-                <w:bCs/>
-                <w:color w:val="000000"/>
-                <w:sz w:val="18"/>
-                <w:szCs w:val="18"/>
-              </w:rPr>
-              <w:t>*</w:t>
-            </w:r>
-          </w:p>
-        </w:tc>
       </w:tr>
       <w:tr ns2:paraId="07684AE5" ns2:textId="77777777">
         <w:tc>
           <w:tcPr>
-            <w:tcW w:w="5349" w:type="dxa"/>
+            <w:tcW w:w="10774" w:type="dxa"/>
             <w:tcBorders>
               <w:right w:val="thinThickThinSmallGap" w:sz="24" w:space="0" w:color="D9D9D9" w:themeColor="background1" w:themeShade="D9"/>
             </w:tcBorders>
             <w:shd w:val="clear" w:color="auto" w:fill="FFFFFF" w:themeFill="background1"/>
+            <w:gridSpan w:val="2"/>
           </w:tcPr>
           <w:p>
             <w:pPr>
@@ -2050,36 +1107,16 @@
             </w:r>
           </w:p>
         </w:tc>
-        <w:tc>
-          <w:tcPr>
-            <w:tcW w:w="5425" w:type="dxa"/>
-            <w:tcBorders>
-              <w:left w:val="thinThickThinSmallGap" w:sz="24" w:space="0" w:color="D9D9D9" w:themeColor="background1" w:themeShade="D9"/>
+      </w:tr>
+      <w:tr ns2:paraId="73C82B08" ns2:textId="77777777">
+        <w:tc>
+          <w:tcPr>
+            <w:tcW w:w="10774" w:type="dxa"/>
+            <w:tcBorders>
+              <w:right w:val="thinThickThinSmallGap" w:sz="24" w:space="0" w:color="D9D9D9" w:themeColor="background1" w:themeShade="D9"/>
             </w:tcBorders>
             <w:shd w:val="clear" w:color="auto" w:fill="FFFFFF" w:themeFill="background1"/>
-          </w:tcPr>
-          <w:p>
-            <w:pPr>
-              <w:spacing w:before="0" w:after="0" w:line="220" w:lineRule="auto"/>
-            </w:pPr>
-            <w:r>
-              <w:rPr>
-                <w:sz w:val="18"/>
-                <w:szCs w:val="18"/>
-              </w:rPr>
-              <w:t>Vlastníka zariadenia: {{ supplier_device_owner }}</w:t>
-            </w:r>
-          </w:p>
-        </w:tc>
-      </w:tr>
-      <w:tr ns2:paraId="73C82B08" ns2:textId="77777777">
-        <w:tc>
-          <w:tcPr>
-            <w:tcW w:w="5349" w:type="dxa"/>
-            <w:tcBorders>
-              <w:right w:val="thinThickThinSmallGap" w:sz="24" w:space="0" w:color="D9D9D9" w:themeColor="background1" w:themeShade="D9"/>
-            </w:tcBorders>
-            <w:shd w:val="clear" w:color="auto" w:fill="FFFFFF" w:themeFill="background1"/>
+            <w:gridSpan w:val="2"/>
           </w:tcPr>
           <w:p>
             <w:pPr>
@@ -2094,35 +1131,15 @@
             </w:r>
           </w:p>
         </w:tc>
-        <w:tc>
-          <w:tcPr>
-            <w:tcW w:w="5425" w:type="dxa"/>
-            <w:tcBorders>
-              <w:left w:val="thinThickThinSmallGap" w:sz="24" w:space="0" w:color="D9D9D9" w:themeColor="background1" w:themeShade="D9"/>
-            </w:tcBorders>
-            <w:shd w:val="clear" w:color="auto" w:fill="FFFFFF" w:themeFill="background1"/>
-          </w:tcPr>
-          <w:p>
-            <w:pPr>
-              <w:spacing w:before="0" w:after="0" w:line="220" w:lineRule="auto"/>
-            </w:pPr>
-            <w:r>
-              <w:rPr>
-                <w:sz w:val="18"/>
-                <w:szCs w:val="18"/>
-              </w:rPr>
-              <w:t>Druh zariadenia: {{ supplier_device_type }}</w:t>
-            </w:r>
-          </w:p>
-        </w:tc>
       </w:tr>
       <w:tr ns2:paraId="4070DCCF" ns2:textId="77777777">
         <w:tc>
           <w:tcPr>
-            <w:tcW w:w="5349" w:type="dxa"/>
-            <w:tcBorders>
-              <w:right w:val="thinThickThinSmallGap" w:sz="24" w:space="0" w:color="D9D9D9" w:themeColor="background1" w:themeShade="D9"/>
-            </w:tcBorders>
+            <w:tcW w:w="10774" w:type="dxa"/>
+            <w:tcBorders>
+              <w:right w:val="thinThickThinSmallGap" w:sz="24" w:space="0" w:color="D9D9D9" w:themeColor="background1" w:themeShade="D9"/>
+            </w:tcBorders>
+            <w:gridSpan w:val="2"/>
           </w:tcPr>
           <w:p>
             <w:pPr>
@@ -2137,34 +1154,15 @@
             </w:r>
           </w:p>
         </w:tc>
-        <w:tc>
-          <w:tcPr>
-            <w:tcW w:w="5425" w:type="dxa"/>
-            <w:tcBorders>
-              <w:left w:val="thinThickThinSmallGap" w:sz="24" w:space="0" w:color="D9D9D9" w:themeColor="background1" w:themeShade="D9"/>
-            </w:tcBorders>
-          </w:tcPr>
-          <w:p>
-            <w:pPr>
-              <w:spacing w:before="0" w:after="0" w:line="220" w:lineRule="auto"/>
-            </w:pPr>
-            <w:r>
-              <w:rPr>
-                <w:sz w:val="18"/>
-                <w:szCs w:val="18"/>
-              </w:rPr>
-              <w:t>Výrobné číslo zariadenia: {{ supplier_device_serial_number }}</w:t>
-            </w:r>
-          </w:p>
-        </w:tc>
       </w:tr>
       <w:tr ns2:paraId="654A391B" ns2:textId="77777777">
         <w:tc>
           <w:tcPr>
-            <w:tcW w:w="5349" w:type="dxa"/>
-            <w:tcBorders>
-              <w:right w:val="thinThickThinSmallGap" w:sz="24" w:space="0" w:color="D9D9D9" w:themeColor="background1" w:themeShade="D9"/>
-            </w:tcBorders>
+            <w:tcW w:w="10774" w:type="dxa"/>
+            <w:tcBorders>
+              <w:right w:val="thinThickThinSmallGap" w:sz="24" w:space="0" w:color="D9D9D9" w:themeColor="background1" w:themeShade="D9"/>
+            </w:tcBorders>
+            <w:gridSpan w:val="2"/>
           </w:tcPr>
           <w:p>
             <w:pPr>
@@ -2179,34 +1177,15 @@
             </w:r>
           </w:p>
         </w:tc>
-        <w:tc>
-          <w:tcPr>
-            <w:tcW w:w="5425" w:type="dxa"/>
-            <w:tcBorders>
-              <w:left w:val="thinThickThinSmallGap" w:sz="24" w:space="0" w:color="D9D9D9" w:themeColor="background1" w:themeShade="D9"/>
-            </w:tcBorders>
-          </w:tcPr>
-          <w:p>
-            <w:pPr>
-              <w:spacing w:before="0" w:after="0" w:line="220" w:lineRule="auto"/>
-            </w:pPr>
-            <w:r>
-              <w:rPr>
-                <w:sz w:val="18"/>
-                <w:szCs w:val="18"/>
-              </w:rPr>
-              <w:t>Platnosť kalibrácie: {{ supplier_calibration_validity }}</w:t>
-            </w:r>
-          </w:p>
-        </w:tc>
       </w:tr>
       <w:tr ns2:paraId="260DFF1E" ns2:textId="77777777">
         <w:tc>
           <w:tcPr>
-            <w:tcW w:w="5349" w:type="dxa"/>
-            <w:tcBorders>
-              <w:right w:val="thinThickThinSmallGap" w:sz="24" w:space="0" w:color="D9D9D9" w:themeColor="background1" w:themeShade="D9"/>
-            </w:tcBorders>
+            <w:tcW w:w="10774" w:type="dxa"/>
+            <w:tcBorders>
+              <w:right w:val="thinThickThinSmallGap" w:sz="24" w:space="0" w:color="D9D9D9" w:themeColor="background1" w:themeShade="D9"/>
+            </w:tcBorders>
+            <w:gridSpan w:val="2"/>
           </w:tcPr>
           <w:p>
             <w:pPr>
@@ -2221,56 +1200,16 @@
             </w:r>
           </w:p>
         </w:tc>
-        <w:tc>
-          <w:tcPr>
-            <w:tcW w:w="5425" w:type="dxa"/>
-            <w:tcBorders>
-              <w:left w:val="thinThickThinSmallGap" w:sz="24" w:space="0" w:color="D9D9D9" w:themeColor="background1" w:themeShade="D9"/>
-            </w:tcBorders>
-          </w:tcPr>
-          <w:p>
-            <w:pPr>
-              <w:spacing w:before="0" w:after="0" w:line="220" w:lineRule="auto"/>
-            </w:pPr>
-            <w:r>
-              <w:rPr>
-                <w:sz w:val="18"/>
-                <w:szCs w:val="18"/>
-              </w:rPr>
-              <w:t>Názov spoločnosti, ktorá vykonala kalibráciu: {{ supplier_calibration_company }}</w:t>
-            </w:r>
-          </w:p>
-        </w:tc>
       </w:tr>
       <w:tr ns2:paraId="317CA731" ns2:textId="77777777">
         <w:tc>
           <w:tcPr>
-            <w:tcW w:w="5349" w:type="dxa"/>
+            <w:tcW w:w="10774" w:type="dxa"/>
             <w:tcBorders>
               <w:right w:val="thinThickThinSmallGap" w:sz="24" w:space="0" w:color="D9D9D9" w:themeColor="background1" w:themeShade="D9"/>
             </w:tcBorders>
             <w:vAlign w:val="center"/>
-          </w:tcPr>
-          <w:p>
-            <w:pPr>
-              <w:spacing w:before="0" w:after="0" w:line="220" w:lineRule="auto"/>
-            </w:pPr>
-            <w:r>
-              <w:rPr>
-                <w:sz w:val="18"/>
-                <w:szCs w:val="18"/>
-              </w:rPr>
-              <w:t>Registračné číslo SNAS: {{ supplier_snas_registration_number }}</w:t>
-            </w:r>
-          </w:p>
-        </w:tc>
-        <w:tc>
-          <w:tcPr>
-            <w:tcW w:w="5425" w:type="dxa"/>
-            <w:tcBorders>
-              <w:left w:val="thinThickThinSmallGap" w:sz="24" w:space="0" w:color="D9D9D9" w:themeColor="background1" w:themeShade="D9"/>
-            </w:tcBorders>
-            <w:vAlign w:val="center"/>
+            <w:gridSpan w:val="2"/>
           </w:tcPr>
           <w:p>
             <w:pPr>
@@ -2292,43 +1231,11 @@
         </w:trPr>
         <w:tc>
           <w:tcPr>
-            <w:tcW w:w="5349" w:type="dxa"/>
-            <w:tcBorders>
-              <w:right w:val="thinThickThinSmallGap" w:sz="24" w:space="0" w:color="D9D9D9" w:themeColor="background1" w:themeShade="D9"/>
-            </w:tcBorders>
-          </w:tcPr>
-          <w:p>
-            <w:pPr>
-              <w:spacing w:before="0" w:after="0" w:line="220" w:lineRule="auto"/>
-            </w:pPr>
-            <w:r>
-              <w:rPr>
-                <w:sz w:val="18"/>
-                <w:szCs w:val="18"/>
-              </w:rPr>
-              <w:t>Iné zistenia:</w:t>
-              <w:br/>
-            </w:r>
-          </w:p>
-          <w:p>
-            <w:pPr>
-              <w:spacing w:before="0" w:after="0" w:line="220" w:lineRule="auto"/>
-            </w:pPr>
-            <w:r>
-              <w:rPr>
-                <w:sz w:val="18"/>
-                <w:szCs w:val="18"/>
-              </w:rPr>
-              <w:t>{{ supplier_other_findings }}</w:t>
-            </w:r>
-          </w:p>
-        </w:tc>
-        <w:tc>
-          <w:tcPr>
-            <w:tcW w:w="5425" w:type="dxa"/>
-            <w:tcBorders>
-              <w:left w:val="thinThickThinSmallGap" w:sz="24" w:space="0" w:color="D9D9D9" w:themeColor="background1" w:themeShade="D9"/>
-            </w:tcBorders>
+            <w:tcW w:w="10774" w:type="dxa"/>
+            <w:tcBorders>
+              <w:right w:val="thinThickThinSmallGap" w:sz="24" w:space="0" w:color="D9D9D9" w:themeColor="background1" w:themeShade="D9"/>
+            </w:tcBorders>
+            <w:gridSpan w:val="2"/>
           </w:tcPr>
           <w:p>
             <w:pPr>
@@ -2363,25 +1270,13 @@
         </w:trPr>
         <w:tc>
           <w:tcPr>
-            <w:tcW w:w="5349" w:type="dxa"/>
-            <w:tcBorders>
-              <w:right w:val="thinThickThinSmallGap" w:sz="24" w:space="0" w:color="D9D9D9" w:themeColor="background1" w:themeShade="D9"/>
-            </w:tcBorders>
+            <w:tcW w:w="10774" w:type="dxa"/>
+            <w:tcBorders>
+              <w:right w:val="thinThickThinSmallGap" w:sz="24" w:space="0" w:color="D9D9D9" w:themeColor="background1" w:themeShade="D9"/>
+            </w:tcBorders>
+            <w:gridSpan w:val="2"/>
           </w:tcPr>
           <w:p ns2:paraId="19B6FF2B" ns2:textId="1AC1628D">
-            <w:r>
-              <w:t>* Vyplniť len v prípade použitia meracích zariadení pri výkone inšpekcie vo vlastníctve druhej strany</w:t>
-            </w:r>
-          </w:p>
-        </w:tc>
-        <w:tc>
-          <w:tcPr>
-            <w:tcW w:w="5425" w:type="dxa"/>
-            <w:tcBorders>
-              <w:left w:val="thinThickThinSmallGap" w:sz="24" w:space="0" w:color="D9D9D9" w:themeColor="background1" w:themeShade="D9"/>
-            </w:tcBorders>
-          </w:tcPr>
-          <w:p ns2:paraId="1C67D882" ns2:textId="07EE8D59">
             <w:r>
               <w:t>* Vyplniť len v prípade použitia meracích zariadení pri výkone inšpekcie vo vlastníctve druhej strany</w:t>
             </w:r>
@@ -2398,17 +1293,18 @@
         <w:tblLook w:val="04A0" w:firstRow="1" w:lastRow="0" w:firstColumn="1" w:lastColumn="0" w:noHBand="0" w:noVBand="1"/>
       </w:tblPr>
       <w:tblGrid>
-        <w:gridCol w:w="5349"/>
-        <w:gridCol w:w="5425"/>
+        <w:gridCol w:w="5387"/>
+        <w:gridCol w:w="5387"/>
       </w:tblGrid>
       <w:tr ns2:paraId="2185525D" ns2:textId="77777777">
         <w:tc>
           <w:tcPr>
-            <w:tcW w:w="5349" w:type="dxa"/>
+            <w:tcW w:w="10774" w:type="dxa"/>
             <w:tcBorders>
               <w:right w:val="thinThickThinSmallGap" w:sz="24" w:space="0" w:color="D9D9D9" w:themeColor="background1" w:themeShade="D9"/>
             </w:tcBorders>
             <w:shd w:val="clear" w:color="auto" w:fill="D9D9D9" w:themeFill="background1" w:themeFillShade="D9"/>
+            <w:gridSpan w:val="2"/>
           </w:tcPr>
           <w:p ns2:paraId="6423DE02" ns2:textId="77777777">
             <w:pPr>
@@ -2428,40 +1324,15 @@
             </w:r>
           </w:p>
         </w:tc>
-        <w:tc>
-          <w:tcPr>
-            <w:tcW w:w="5425" w:type="dxa"/>
-            <w:tcBorders>
-              <w:left w:val="thinThickThinSmallGap" w:sz="24" w:space="0" w:color="D9D9D9" w:themeColor="background1" w:themeShade="D9"/>
-            </w:tcBorders>
-            <w:shd w:val="clear" w:color="auto" w:fill="D9D9D9" w:themeFill="background1" w:themeFillShade="D9"/>
-          </w:tcPr>
-          <w:p ns2:paraId="4F08D94E" ns2:textId="77777777">
-            <w:pPr>
-              <w:spacing w:line="300" w:lineRule="auto"/>
-              <w:jc w:val="center"/>
-            </w:pPr>
-            <w:r>
-              <w:rPr>
-                <w:rFonts w:ascii="Calibri" w:eastAsia="Times New Roman" w:hAnsi="Calibri" w:cs="Calibri"/>
-                <w:b/>
-                <w:bCs/>
-                <w:color w:val="000000"/>
-                <w:sz w:val="18"/>
-                <w:szCs w:val="18"/>
-              </w:rPr>
-              <w:t>Preskúmanie spôsobilosti dodávateľa*</w:t>
-            </w:r>
-          </w:p>
-        </w:tc>
       </w:tr>
       <w:tr ns2:paraId="0A40ACCF" ns2:textId="77777777">
         <w:tc>
           <w:tcPr>
-            <w:tcW w:w="5349" w:type="dxa"/>
-            <w:tcBorders>
-              <w:right w:val="thinThickThinSmallGap" w:sz="24" w:space="0" w:color="D9D9D9" w:themeColor="background1" w:themeShade="D9"/>
-            </w:tcBorders>
+            <w:tcW w:w="10774" w:type="dxa"/>
+            <w:tcBorders>
+              <w:right w:val="thinThickThinSmallGap" w:sz="24" w:space="0" w:color="D9D9D9" w:themeColor="background1" w:themeShade="D9"/>
+            </w:tcBorders>
+            <w:gridSpan w:val="2"/>
           </w:tcPr>
           <w:p>
             <w:pPr>
@@ -2476,34 +1347,15 @@
             </w:r>
           </w:p>
         </w:tc>
-        <w:tc>
-          <w:tcPr>
-            <w:tcW w:w="5425" w:type="dxa"/>
-            <w:tcBorders>
-              <w:left w:val="thinThickThinSmallGap" w:sz="24" w:space="0" w:color="D9D9D9" w:themeColor="background1" w:themeShade="D9"/>
-            </w:tcBorders>
-          </w:tcPr>
-          <w:p>
-            <w:pPr>
-              <w:spacing w:before="0" w:after="0" w:line="220" w:lineRule="auto"/>
-            </w:pPr>
-            <w:r>
-              <w:rPr>
-                <w:sz w:val="18"/>
-                <w:szCs w:val="18"/>
-              </w:rPr>
-              <w:t>Vlastníka zariadenia: {{ supplier_device_owner }}</w:t>
-            </w:r>
-          </w:p>
-        </w:tc>
       </w:tr>
       <w:tr ns2:paraId="63062BEC" ns2:textId="77777777">
         <w:tc>
           <w:tcPr>
-            <w:tcW w:w="5349" w:type="dxa"/>
-            <w:tcBorders>
-              <w:right w:val="thinThickThinSmallGap" w:sz="24" w:space="0" w:color="D9D9D9" w:themeColor="background1" w:themeShade="D9"/>
-            </w:tcBorders>
+            <w:tcW w:w="10774" w:type="dxa"/>
+            <w:tcBorders>
+              <w:right w:val="thinThickThinSmallGap" w:sz="24" w:space="0" w:color="D9D9D9" w:themeColor="background1" w:themeShade="D9"/>
+            </w:tcBorders>
+            <w:gridSpan w:val="2"/>
           </w:tcPr>
           <w:p>
             <w:pPr>
@@ -2518,34 +1370,15 @@
             </w:r>
           </w:p>
         </w:tc>
-        <w:tc>
-          <w:tcPr>
-            <w:tcW w:w="5425" w:type="dxa"/>
-            <w:tcBorders>
-              <w:left w:val="thinThickThinSmallGap" w:sz="24" w:space="0" w:color="D9D9D9" w:themeColor="background1" w:themeShade="D9"/>
-            </w:tcBorders>
-          </w:tcPr>
-          <w:p>
-            <w:pPr>
-              <w:spacing w:before="0" w:after="0" w:line="220" w:lineRule="auto"/>
-            </w:pPr>
-            <w:r>
-              <w:rPr>
-                <w:sz w:val="18"/>
-                <w:szCs w:val="18"/>
-              </w:rPr>
-              <w:t>Druh zariadenia: {{ supplier_device_type }}</w:t>
-            </w:r>
-          </w:p>
-        </w:tc>
       </w:tr>
       <w:tr ns2:paraId="66B2894D" ns2:textId="77777777">
         <w:tc>
           <w:tcPr>
-            <w:tcW w:w="5349" w:type="dxa"/>
-            <w:tcBorders>
-              <w:right w:val="thinThickThinSmallGap" w:sz="24" w:space="0" w:color="D9D9D9" w:themeColor="background1" w:themeShade="D9"/>
-            </w:tcBorders>
+            <w:tcW w:w="10774" w:type="dxa"/>
+            <w:tcBorders>
+              <w:right w:val="thinThickThinSmallGap" w:sz="24" w:space="0" w:color="D9D9D9" w:themeColor="background1" w:themeShade="D9"/>
+            </w:tcBorders>
+            <w:gridSpan w:val="2"/>
           </w:tcPr>
           <w:p>
             <w:pPr>
@@ -2560,34 +1393,15 @@
             </w:r>
           </w:p>
         </w:tc>
-        <w:tc>
-          <w:tcPr>
-            <w:tcW w:w="5425" w:type="dxa"/>
-            <w:tcBorders>
-              <w:left w:val="thinThickThinSmallGap" w:sz="24" w:space="0" w:color="D9D9D9" w:themeColor="background1" w:themeShade="D9"/>
-            </w:tcBorders>
-          </w:tcPr>
-          <w:p>
-            <w:pPr>
-              <w:spacing w:before="0" w:after="0" w:line="220" w:lineRule="auto"/>
-            </w:pPr>
-            <w:r>
-              <w:rPr>
-                <w:sz w:val="18"/>
-                <w:szCs w:val="18"/>
-              </w:rPr>
-              <w:t>Výrobné číslo zariadenia: {{ supplier_device_serial_number }}</w:t>
-            </w:r>
-          </w:p>
-        </w:tc>
       </w:tr>
       <w:tr ns2:paraId="49EA408E" ns2:textId="77777777">
         <w:tc>
           <w:tcPr>
-            <w:tcW w:w="5349" w:type="dxa"/>
-            <w:tcBorders>
-              <w:right w:val="thinThickThinSmallGap" w:sz="24" w:space="0" w:color="D9D9D9" w:themeColor="background1" w:themeShade="D9"/>
-            </w:tcBorders>
+            <w:tcW w:w="10774" w:type="dxa"/>
+            <w:tcBorders>
+              <w:right w:val="thinThickThinSmallGap" w:sz="24" w:space="0" w:color="D9D9D9" w:themeColor="background1" w:themeShade="D9"/>
+            </w:tcBorders>
+            <w:gridSpan w:val="2"/>
           </w:tcPr>
           <w:p>
             <w:pPr>
@@ -2602,34 +1416,15 @@
             </w:r>
           </w:p>
         </w:tc>
-        <w:tc>
-          <w:tcPr>
-            <w:tcW w:w="5425" w:type="dxa"/>
-            <w:tcBorders>
-              <w:left w:val="thinThickThinSmallGap" w:sz="24" w:space="0" w:color="D9D9D9" w:themeColor="background1" w:themeShade="D9"/>
-            </w:tcBorders>
-          </w:tcPr>
-          <w:p>
-            <w:pPr>
-              <w:spacing w:before="0" w:after="0" w:line="220" w:lineRule="auto"/>
-            </w:pPr>
-            <w:r>
-              <w:rPr>
-                <w:sz w:val="18"/>
-                <w:szCs w:val="18"/>
-              </w:rPr>
-              <w:t>Platnosť kalibrácie: {{ supplier_calibration_validity }}</w:t>
-            </w:r>
-          </w:p>
-        </w:tc>
       </w:tr>
       <w:tr ns2:paraId="6B9D5136" ns2:textId="77777777">
         <w:tc>
           <w:tcPr>
-            <w:tcW w:w="5349" w:type="dxa"/>
-            <w:tcBorders>
-              <w:right w:val="thinThickThinSmallGap" w:sz="24" w:space="0" w:color="D9D9D9" w:themeColor="background1" w:themeShade="D9"/>
-            </w:tcBorders>
+            <w:tcW w:w="10774" w:type="dxa"/>
+            <w:tcBorders>
+              <w:right w:val="thinThickThinSmallGap" w:sz="24" w:space="0" w:color="D9D9D9" w:themeColor="background1" w:themeShade="D9"/>
+            </w:tcBorders>
+            <w:gridSpan w:val="2"/>
           </w:tcPr>
           <w:p>
             <w:pPr>
@@ -2644,56 +1439,16 @@
             </w:r>
           </w:p>
         </w:tc>
-        <w:tc>
-          <w:tcPr>
-            <w:tcW w:w="5425" w:type="dxa"/>
-            <w:tcBorders>
-              <w:left w:val="thinThickThinSmallGap" w:sz="24" w:space="0" w:color="D9D9D9" w:themeColor="background1" w:themeShade="D9"/>
-            </w:tcBorders>
-          </w:tcPr>
-          <w:p>
-            <w:pPr>
-              <w:spacing w:before="0" w:after="0" w:line="220" w:lineRule="auto"/>
-            </w:pPr>
-            <w:r>
-              <w:rPr>
-                <w:sz w:val="18"/>
-                <w:szCs w:val="18"/>
-              </w:rPr>
-              <w:t>Názov spoločnosti, ktorá vykonala kalibráciu: {{ supplier_calibration_company }}</w:t>
-            </w:r>
-          </w:p>
-        </w:tc>
       </w:tr>
       <w:tr ns2:paraId="786C421B" ns2:textId="77777777">
         <w:tc>
           <w:tcPr>
-            <w:tcW w:w="5349" w:type="dxa"/>
+            <w:tcW w:w="10774" w:type="dxa"/>
             <w:tcBorders>
               <w:right w:val="thinThickThinSmallGap" w:sz="24" w:space="0" w:color="D9D9D9" w:themeColor="background1" w:themeShade="D9"/>
             </w:tcBorders>
             <w:vAlign w:val="center"/>
-          </w:tcPr>
-          <w:p>
-            <w:pPr>
-              <w:spacing w:before="0" w:after="0" w:line="220" w:lineRule="auto"/>
-            </w:pPr>
-            <w:r>
-              <w:rPr>
-                <w:sz w:val="18"/>
-                <w:szCs w:val="18"/>
-              </w:rPr>
-              <w:t>Registračné číslo SNAS: {{ supplier_snas_registration_number }}</w:t>
-            </w:r>
-          </w:p>
-        </w:tc>
-        <w:tc>
-          <w:tcPr>
-            <w:tcW w:w="5425" w:type="dxa"/>
-            <w:tcBorders>
-              <w:left w:val="thinThickThinSmallGap" w:sz="24" w:space="0" w:color="D9D9D9" w:themeColor="background1" w:themeShade="D9"/>
-            </w:tcBorders>
-            <w:vAlign w:val="center"/>
+            <w:gridSpan w:val="2"/>
           </w:tcPr>
           <w:p>
             <w:pPr>
@@ -2715,43 +1470,11 @@
         </w:trPr>
         <w:tc>
           <w:tcPr>
-            <w:tcW w:w="5349" w:type="dxa"/>
-            <w:tcBorders>
-              <w:right w:val="thinThickThinSmallGap" w:sz="24" w:space="0" w:color="D9D9D9" w:themeColor="background1" w:themeShade="D9"/>
-            </w:tcBorders>
-          </w:tcPr>
-          <w:p>
-            <w:pPr>
-              <w:spacing w:before="0" w:after="0" w:line="220" w:lineRule="auto"/>
-            </w:pPr>
-            <w:r>
-              <w:rPr>
-                <w:sz w:val="18"/>
-                <w:szCs w:val="18"/>
-              </w:rPr>
-              <w:t>Iné zistenia:</w:t>
-              <w:br/>
-            </w:r>
-          </w:p>
-          <w:p>
-            <w:pPr>
-              <w:spacing w:before="0" w:after="0" w:line="220" w:lineRule="auto"/>
-            </w:pPr>
-            <w:r>
-              <w:rPr>
-                <w:sz w:val="18"/>
-                <w:szCs w:val="18"/>
-              </w:rPr>
-              <w:t>{{ supplier_other_findings }}</w:t>
-            </w:r>
-          </w:p>
-        </w:tc>
-        <w:tc>
-          <w:tcPr>
-            <w:tcW w:w="5425" w:type="dxa"/>
-            <w:tcBorders>
-              <w:left w:val="thinThickThinSmallGap" w:sz="24" w:space="0" w:color="D9D9D9" w:themeColor="background1" w:themeShade="D9"/>
-            </w:tcBorders>
+            <w:tcW w:w="10774" w:type="dxa"/>
+            <w:tcBorders>
+              <w:right w:val="thinThickThinSmallGap" w:sz="24" w:space="0" w:color="D9D9D9" w:themeColor="background1" w:themeShade="D9"/>
+            </w:tcBorders>
+            <w:gridSpan w:val="2"/>
           </w:tcPr>
           <w:p>
             <w:pPr>
@@ -2786,25 +1509,13 @@
         </w:trPr>
         <w:tc>
           <w:tcPr>
-            <w:tcW w:w="5349" w:type="dxa"/>
-            <w:tcBorders>
-              <w:right w:val="thinThickThinSmallGap" w:sz="24" w:space="0" w:color="D9D9D9" w:themeColor="background1" w:themeShade="D9"/>
-            </w:tcBorders>
+            <w:tcW w:w="10774" w:type="dxa"/>
+            <w:tcBorders>
+              <w:right w:val="thinThickThinSmallGap" w:sz="24" w:space="0" w:color="D9D9D9" w:themeColor="background1" w:themeShade="D9"/>
+            </w:tcBorders>
+            <w:gridSpan w:val="2"/>
           </w:tcPr>
           <w:p ns2:paraId="41336FF8" ns2:textId="5CCFCBB2">
-            <w:r>
-              <w:t>* Vyplniť len v prípade použitia meracích zariadení pri výkone inšpekcie vo vlastníctve druhej strany</w:t>
-            </w:r>
-          </w:p>
-        </w:tc>
-        <w:tc>
-          <w:tcPr>
-            <w:tcW w:w="5425" w:type="dxa"/>
-            <w:tcBorders>
-              <w:left w:val="thinThickThinSmallGap" w:sz="24" w:space="0" w:color="D9D9D9" w:themeColor="background1" w:themeShade="D9"/>
-            </w:tcBorders>
-          </w:tcPr>
-          <w:p ns2:paraId="6D5B5E20" ns2:textId="65B145CE">
             <w:r>
               <w:t>* Vyplniť len v prípade použitia meracích zariadení pri výkone inšpekcie vo vlastníctve druhej strany</w:t>
             </w:r>

</xml_diff>

<commit_message>
Remove duplicated supplier capability section from prvotny template
Co-Authored-By: Claude Fable 5 <noreply@anthropic.com>
</commit_message>
<xml_diff>
--- a/backend/app/templates/prvotny_zaznam_z_template.docx
+++ b/backend/app/templates/prvotny_zaznam_z_template.docx
@@ -1842,293 +1842,6 @@
       </w:tr>
     </w:tbl>
     <w:p ns2:paraId="5A565B86" ns2:textId="3DE57739"/>
-    <w:tbl>
-      <w:tblPr>
-        <w:tblStyle w:val="Mriekatabuky"/>
-        <w:tblW w:w="10774" w:type="dxa"/>
-        <w:tblInd w:w="-743" w:type="dxa"/>
-        <w:tblLook w:val="04A0" w:firstRow="1" w:lastRow="0" w:firstColumn="1" w:lastColumn="0" w:noHBand="0" w:noVBand="1"/>
-      </w:tblPr>
-      <w:tblGrid>
-        <w:gridCol w:w="5387"/>
-        <w:gridCol w:w="5387"/>
-      </w:tblGrid>
-      <w:tr ns2:paraId="2185525D" ns2:textId="77777777">
-        <w:tc>
-          <w:tcPr>
-            <w:tcW w:w="10774" w:type="dxa"/>
-            <w:tcBorders>
-              <w:right w:val="thinThickThinSmallGap" w:sz="24" w:space="0" w:color="D9D9D9" w:themeColor="background1" w:themeShade="D9"/>
-            </w:tcBorders>
-            <w:shd w:val="clear" w:color="auto" w:fill="D9D9D9" w:themeFill="background1" w:themeFillShade="D9"/>
-            <w:gridSpan w:val="2"/>
-          </w:tcPr>
-          <w:p ns2:paraId="6423DE02" ns2:textId="77777777">
-            <w:pPr>
-              <w:spacing w:line="300" w:lineRule="auto"/>
-              <w:jc w:val="center"/>
-            </w:pPr>
-            <w:r>
-              <w:rPr>
-                <w:rFonts w:ascii="Calibri" w:eastAsia="Times New Roman" w:hAnsi="Calibri" w:cs="Calibri"/>
-                <w:b/>
-                <w:bCs/>
-                <w:color w:val="000000"/>
-                <w:sz w:val="18"/>
-                <w:szCs w:val="18"/>
-              </w:rPr>
-              <w:t>Preskúmanie spôsobilosti dodávateľa*</w:t>
-            </w:r>
-          </w:p>
-        </w:tc>
-      </w:tr>
-      <w:tr ns2:paraId="0A40ACCF" ns2:textId="77777777">
-        <w:tc>
-          <w:tcPr>
-            <w:tcW w:w="10774" w:type="dxa"/>
-            <w:tcBorders>
-              <w:right w:val="thinThickThinSmallGap" w:sz="24" w:space="0" w:color="D9D9D9" w:themeColor="background1" w:themeShade="D9"/>
-            </w:tcBorders>
-            <w:gridSpan w:val="2"/>
-          </w:tcPr>
-          <w:p>
-            <w:pPr>
-              <w:spacing w:before="0" w:after="0" w:line="220" w:lineRule="auto"/>
-            </w:pPr>
-            <w:r>
-              <w:rPr>
-                <w:sz w:val="18"/>
-                <w:szCs w:val="18"/>
-              </w:rPr>
-              <w:t xml:space="preserve">Vlastníka zariadenia: </w:t>
-            </w:r>
-            <w:r>
-              <w:rPr>
-                <w:b/>
-                <w:sz w:val="18"/>
-                <w:szCs w:val="18"/>
-              </w:rPr>
-              <w:t>{{ supplier_device_owner }}</w:t>
-            </w:r>
-          </w:p>
-        </w:tc>
-      </w:tr>
-      <w:tr ns2:paraId="63062BEC" ns2:textId="77777777">
-        <w:tc>
-          <w:tcPr>
-            <w:tcW w:w="10774" w:type="dxa"/>
-            <w:tcBorders>
-              <w:right w:val="thinThickThinSmallGap" w:sz="24" w:space="0" w:color="D9D9D9" w:themeColor="background1" w:themeShade="D9"/>
-            </w:tcBorders>
-            <w:gridSpan w:val="2"/>
-          </w:tcPr>
-          <w:p>
-            <w:pPr>
-              <w:spacing w:before="0" w:after="0" w:line="220" w:lineRule="auto"/>
-            </w:pPr>
-            <w:r>
-              <w:rPr>
-                <w:sz w:val="18"/>
-                <w:szCs w:val="18"/>
-              </w:rPr>
-              <w:t xml:space="preserve">Druh zariadenia: </w:t>
-            </w:r>
-            <w:r>
-              <w:rPr>
-                <w:b/>
-                <w:sz w:val="18"/>
-                <w:szCs w:val="18"/>
-              </w:rPr>
-              <w:t>{{ supplier_device_type }}</w:t>
-            </w:r>
-          </w:p>
-        </w:tc>
-      </w:tr>
-      <w:tr ns2:paraId="66B2894D" ns2:textId="77777777">
-        <w:tc>
-          <w:tcPr>
-            <w:tcW w:w="10774" w:type="dxa"/>
-            <w:tcBorders>
-              <w:right w:val="thinThickThinSmallGap" w:sz="24" w:space="0" w:color="D9D9D9" w:themeColor="background1" w:themeShade="D9"/>
-            </w:tcBorders>
-            <w:gridSpan w:val="2"/>
-          </w:tcPr>
-          <w:p>
-            <w:pPr>
-              <w:spacing w:before="0" w:after="0" w:line="220" w:lineRule="auto"/>
-            </w:pPr>
-            <w:r>
-              <w:rPr>
-                <w:sz w:val="18"/>
-                <w:szCs w:val="18"/>
-              </w:rPr>
-              <w:t xml:space="preserve">Výrobné číslo zariadenia: </w:t>
-            </w:r>
-            <w:r>
-              <w:rPr>
-                <w:b/>
-                <w:sz w:val="18"/>
-                <w:szCs w:val="18"/>
-              </w:rPr>
-              <w:t>{{ supplier_device_serial_number }}</w:t>
-            </w:r>
-          </w:p>
-        </w:tc>
-      </w:tr>
-      <w:tr ns2:paraId="49EA408E" ns2:textId="77777777">
-        <w:tc>
-          <w:tcPr>
-            <w:tcW w:w="10774" w:type="dxa"/>
-            <w:tcBorders>
-              <w:right w:val="thinThickThinSmallGap" w:sz="24" w:space="0" w:color="D9D9D9" w:themeColor="background1" w:themeShade="D9"/>
-            </w:tcBorders>
-            <w:gridSpan w:val="2"/>
-          </w:tcPr>
-          <w:p>
-            <w:pPr>
-              <w:spacing w:before="0" w:after="0" w:line="220" w:lineRule="auto"/>
-            </w:pPr>
-            <w:r>
-              <w:rPr>
-                <w:sz w:val="18"/>
-                <w:szCs w:val="18"/>
-              </w:rPr>
-              <w:t xml:space="preserve">Platnosť kalibrácie: </w:t>
-            </w:r>
-            <w:r>
-              <w:rPr>
-                <w:b/>
-                <w:sz w:val="18"/>
-                <w:szCs w:val="18"/>
-              </w:rPr>
-              <w:t>{{ supplier_calibration_validity }}</w:t>
-            </w:r>
-          </w:p>
-        </w:tc>
-      </w:tr>
-      <w:tr ns2:paraId="6B9D5136" ns2:textId="77777777">
-        <w:tc>
-          <w:tcPr>
-            <w:tcW w:w="10774" w:type="dxa"/>
-            <w:tcBorders>
-              <w:right w:val="thinThickThinSmallGap" w:sz="24" w:space="0" w:color="D9D9D9" w:themeColor="background1" w:themeShade="D9"/>
-            </w:tcBorders>
-            <w:gridSpan w:val="2"/>
-          </w:tcPr>
-          <w:p>
-            <w:pPr>
-              <w:spacing w:before="0" w:after="0" w:line="220" w:lineRule="auto"/>
-            </w:pPr>
-            <w:r>
-              <w:rPr>
-                <w:sz w:val="18"/>
-                <w:szCs w:val="18"/>
-              </w:rPr>
-              <w:t xml:space="preserve">Názov spoločnosti, ktorá vykonala kalibráciu: </w:t>
-            </w:r>
-            <w:r>
-              <w:rPr>
-                <w:b/>
-                <w:sz w:val="18"/>
-                <w:szCs w:val="18"/>
-              </w:rPr>
-              <w:t>{{ supplier_calibration_company }}</w:t>
-            </w:r>
-          </w:p>
-        </w:tc>
-      </w:tr>
-      <w:tr ns2:paraId="786C421B" ns2:textId="77777777">
-        <w:tc>
-          <w:tcPr>
-            <w:tcW w:w="10774" w:type="dxa"/>
-            <w:tcBorders>
-              <w:right w:val="thinThickThinSmallGap" w:sz="24" w:space="0" w:color="D9D9D9" w:themeColor="background1" w:themeShade="D9"/>
-            </w:tcBorders>
-            <w:vAlign w:val="center"/>
-            <w:gridSpan w:val="2"/>
-          </w:tcPr>
-          <w:p>
-            <w:pPr>
-              <w:spacing w:before="0" w:after="0" w:line="220" w:lineRule="auto"/>
-            </w:pPr>
-            <w:r>
-              <w:rPr>
-                <w:sz w:val="18"/>
-                <w:szCs w:val="18"/>
-              </w:rPr>
-              <w:t xml:space="preserve">Registračné číslo SNAS: </w:t>
-            </w:r>
-            <w:r>
-              <w:rPr>
-                <w:b/>
-                <w:sz w:val="18"/>
-                <w:szCs w:val="18"/>
-              </w:rPr>
-              <w:t>{{ supplier_snas_registration_number }}</w:t>
-            </w:r>
-          </w:p>
-        </w:tc>
-      </w:tr>
-      <w:tr ns2:paraId="7DF52904" ns2:textId="77777777">
-        <w:trPr>
-          <w:trHeight w:val="2326"/>
-        </w:trPr>
-        <w:tc>
-          <w:tcPr>
-            <w:tcW w:w="10774" w:type="dxa"/>
-            <w:tcBorders>
-              <w:right w:val="thinThickThinSmallGap" w:sz="24" w:space="0" w:color="D9D9D9" w:themeColor="background1" w:themeShade="D9"/>
-            </w:tcBorders>
-            <w:gridSpan w:val="2"/>
-          </w:tcPr>
-          <w:p>
-            <w:pPr>
-              <w:spacing w:before="0" w:after="0" w:line="220" w:lineRule="auto"/>
-            </w:pPr>
-            <w:r>
-              <w:rPr>
-                <w:sz w:val="18"/>
-                <w:szCs w:val="18"/>
-              </w:rPr>
-              <w:t>Iné zistenia:</w:t>
-              <w:br/>
-            </w:r>
-          </w:p>
-          <w:p>
-            <w:pPr>
-              <w:spacing w:before="0" w:after="0" w:line="220" w:lineRule="auto"/>
-            </w:pPr>
-            <w:r>
-              <w:rPr>
-                <w:b/>
-                <w:sz w:val="18"/>
-                <w:szCs w:val="18"/>
-              </w:rPr>
-              <w:t>{{ supplier_other_findings }}</w:t>
-            </w:r>
-          </w:p>
-        </w:tc>
-      </w:tr>
-      <w:tr ns2:paraId="6536D414" ns2:textId="77777777">
-        <w:trPr>
-          <w:trHeight w:val="292"/>
-        </w:trPr>
-        <w:tc>
-          <w:tcPr>
-            <w:tcW w:w="10774" w:type="dxa"/>
-            <w:tcBorders>
-              <w:right w:val="thinThickThinSmallGap" w:sz="24" w:space="0" w:color="D9D9D9" w:themeColor="background1" w:themeShade="D9"/>
-            </w:tcBorders>
-            <w:gridSpan w:val="2"/>
-          </w:tcPr>
-          <w:p ns2:paraId="41336FF8" ns2:textId="5CCFCBB2">
-            <w:r>
-              <w:t>* Vyplniť len v prípade použitia meracích zariadení pri výkone inšpekcie vo vlastníctve druhej strany</w:t>
-            </w:r>
-          </w:p>
-        </w:tc>
-      </w:tr>
-    </w:tbl>
     <w:p ns2:paraId="3F20B09A" ns2:textId="77777777"/>
     <w:sectPr>
       <w:headerReference w:type="default" ns3:id="rId8"/>

</xml_diff>